<commit_message>
Update course documentation and synchronize project files and assets
Replit-Commit-Author: Agent
</commit_message>
<xml_diff>
--- a/Curso_Fullstack_Python_Django_React/01_FUNDAMENTOS_DJANGO/Aula_1_Django_Primeiro_Projeto_1789878282232.docx
+++ b/Curso_Fullstack_Python_Django_React/01_FUNDAMENTOS_DJANGO/Aula_1_Django_Primeiro_Projeto_1789878282232.docx
@@ -1858,6 +1858,19 @@
       <w:t>TaskFlow • Curso de Django • Aula 1</w:t>
     </w:r>
   </w:p>
+  <w:p>
+    <w:pPr>
+      <w:jc w:val="center"/>
+    </w:pPr>
+    <w:r>
+      <w:rPr>
+        <w:rFonts w:ascii="Arial" w:hAnsi="Arial"/>
+        <w:color w:val="64748B"/>
+        <w:sz w:val="16"/>
+      </w:rPr>
+      <w:t>Elaborado por Osvaldo Queta — Engenheiro Informático desde 2015 — Programador Sénior com mais de 8 anos de experiência</w:t>
+    </w:r>
+  </w:p>
 </w:ftr>
 </file>
 

</xml_diff>

<commit_message>
Update fullstack course documentation and metadata assets
Replit-Commit-Author: Agent
</commit_message>
<xml_diff>
--- a/Curso_Fullstack_Python_Django_React/01_FUNDAMENTOS_DJANGO/Aula_1_Django_Primeiro_Projeto_1789878282232.docx
+++ b/Curso_Fullstack_Python_Django_React/01_FUNDAMENTOS_DJANGO/Aula_1_Django_Primeiro_Projeto_1789878282232.docx
@@ -1834,6 +1834,7 @@
     </w:p>
     <w:sectPr>
       <w:footerReference w:type="default" r:id="rId9"/>
+      <w:headerReference w:type="default" r:id="rId11"/>
       <w:pgSz w:w="12240" w:h="15840"/>
       <w:pgMar w:top="1080" w:right="1224" w:bottom="1008" w:left="1224" w:header="720" w:footer="720" w:gutter="0"/>
       <w:cols w:space="720"/>
@@ -1872,6 +1873,26 @@
     </w:r>
   </w:p>
 </w:ftr>
+</file>
+
+<file path=word/header1.xml><?xml version="1.0" encoding="utf-8"?>
+<w:hdr xmlns:m="http://schemas.openxmlformats.org/officeDocument/2006/math" xmlns:mc="http://schemas.openxmlformats.org/markup-compatibility/2006" xmlns:mo="http://schemas.microsoft.com/office/mac/office/2008/main" xmlns:mv="urn:schemas-microsoft-com:mac:vml" xmlns:o="urn:schemas-microsoft-com:office:office" xmlns:r="http://schemas.openxmlformats.org/officeDocument/2006/relationships" xmlns:v="urn:schemas-microsoft-com:vml" xmlns:w10="urn:schemas-microsoft-com:office:word" xmlns:w14="http://schemas.microsoft.com/office/word/2010/wordml" xmlns:w="http://schemas.openxmlformats.org/wordprocessingml/2006/main" xmlns:wne="http://schemas.microsoft.com/office/word/2006/wordml" xmlns:wp14="http://schemas.microsoft.com/office/word/2010/wordprocessingDrawing" xmlns:wp="http://schemas.openxmlformats.org/drawingml/2006/wordprocessingDrawing" xmlns:wpc="http://schemas.microsoft.com/office/word/2010/wordprocessingCanvas" xmlns:wpg="http://schemas.microsoft.com/office/word/2010/wordprocessingGroup" xmlns:wpi="http://schemas.microsoft.com/office/word/2010/wordprocessingInk" xmlns:wps="http://schemas.microsoft.com/office/word/2010/wordprocessingShape" mc:Ignorable="w14 wp14">
+  <w:p>
+    <w:pPr>
+      <w:pStyle w:val="Header"/>
+      <w:jc w:val="center"/>
+    </w:pPr>
+    <w:r>
+      <w:rPr>
+        <w:rFonts w:ascii="Arial" w:hAnsi="Arial"/>
+        <w:b/>
+        <w:color w:val="0F172A"/>
+        <w:sz w:val="18"/>
+      </w:rPr>
+      <w:t>Analista de Sistemas</w:t>
+    </w:r>
+  </w:p>
+</w:hdr>
 </file>
 
 <file path=word/numbering.xml><?xml version="1.0" encoding="utf-8"?>

</xml_diff>

<commit_message>
Update course materials and remove project configuration files
Replit-Commit-Author: Agent
</commit_message>
<xml_diff>
--- a/Curso_Fullstack_Python_Django_React/01_FUNDAMENTOS_DJANGO/Aula_1_Django_Primeiro_Projeto_1789878282232.docx
+++ b/Curso_Fullstack_Python_Django_React/01_FUNDAMENTOS_DJANGO/Aula_1_Django_Primeiro_Projeto_1789878282232.docx
@@ -1,1847 +1,1844 @@
 
 <file path=word/document.xml><?xml version="1.0" encoding="utf-8"?>
-<w:document xmlns:wpc="http://schemas.microsoft.com/office/word/2010/wordprocessingCanvas" xmlns:mo="http://schemas.microsoft.com/office/mac/office/2008/main" xmlns:mc="http://schemas.openxmlformats.org/markup-compatibility/2006" xmlns:mv="urn:schemas-microsoft-com:mac:vml" xmlns:o="urn:schemas-microsoft-com:office:office" xmlns:r="http://schemas.openxmlformats.org/officeDocument/2006/relationships" xmlns:m="http://schemas.openxmlformats.org/officeDocument/2006/math" xmlns:v="urn:schemas-microsoft-com:vml" xmlns:wp14="http://schemas.microsoft.com/office/word/2010/wordprocessingDrawing" xmlns:wp="http://schemas.openxmlformats.org/drawingml/2006/wordprocessingDrawing" xmlns:w10="urn:schemas-microsoft-com:office:word" xmlns:w="http://schemas.openxmlformats.org/wordprocessingml/2006/main" xmlns:w14="http://schemas.microsoft.com/office/word/2010/wordml" xmlns:wpg="http://schemas.microsoft.com/office/word/2010/wordprocessingGroup" xmlns:wpi="http://schemas.microsoft.com/office/word/2010/wordprocessingInk" xmlns:wne="http://schemas.microsoft.com/office/word/2006/wordml" xmlns:wps="http://schemas.microsoft.com/office/word/2010/wordprocessingShape" mc:Ignorable="w14 wp14">
-  <w:body>
-    <w:p>
-      <w:pPr>
-        <w:spacing w:before="1400"/>
-        <w:jc w:val="center"/>
-      </w:pPr>
-      <w:r>
-        <w:rPr>
-          <w:b/>
-          <w:color w:val="1E669B"/>
-          <w:sz w:val="28"/>
-        </w:rPr>
-        <w:t>CURSO PRÁTICO DE DJANGO</w:t>
-      </w:r>
-    </w:p>
-    <w:p>
-      <w:pPr>
-        <w:jc w:val="center"/>
-      </w:pPr>
-      <w:r>
-        <w:rPr>
-          <w:b/>
-          <w:color w:val="123B5D"/>
-          <w:sz w:val="60"/>
-        </w:rPr>
-        <w:t>Aula 1</w:t>
-        <w:br/>
-        <w:t>Criar o primeiro projeto Django</w:t>
-      </w:r>
-    </w:p>
-    <w:p>
-      <w:pPr>
-        <w:jc w:val="center"/>
-      </w:pPr>
-      <w:r>
-        <w:rPr>
-          <w:i/>
-          <w:color w:val="475569"/>
-          <w:sz w:val="28"/>
-        </w:rPr>
-        <w:t>Do Python para aplicações web reais</w:t>
-      </w:r>
-    </w:p>
-    <w:p/>
-    <w:tbl>
-      <w:tblPr>
-        <w:tblW w:type="auto" w:w="0"/>
-        <w:jc w:val="center"/>
-        <w:tblLayout w:type="fixed"/>
-        <w:tblLook w:firstColumn="1" w:firstRow="1" w:lastColumn="0" w:lastRow="0" w:noHBand="0" w:noVBand="1" w:val="04A0"/>
-      </w:tblPr>
-      <w:tblGrid>
-        <w:gridCol w:w="4896"/>
-        <w:gridCol w:w="4896"/>
-      </w:tblGrid>
-      <w:tr>
-        <w:tc>
-          <w:tcPr>
-            <w:tcW w:type="dxa" w:w="2304"/>
-            <w:shd w:fill="E0F2FE"/>
-            <w:tcBorders>
-              <w:top w:val="single" w:sz="4" w:color="CBD5E1"/>
-              <w:left w:val="single" w:sz="4" w:color="CBD5E1"/>
-              <w:bottom w:val="single" w:sz="4" w:color="CBD5E1"/>
-              <w:right w:val="single" w:sz="4" w:color="CBD5E1"/>
-            </w:tcBorders>
-          </w:tcPr>
-          <w:p>
-            <w:r>
-              <w:rPr>
-                <w:b/>
-              </w:rPr>
-              <w:t>Projeto-guia</w:t>
-            </w:r>
-          </w:p>
-        </w:tc>
-        <w:tc>
-          <w:tcPr>
-            <w:tcW w:type="dxa" w:w="6912"/>
-            <w:tcBorders>
-              <w:top w:val="single" w:sz="4" w:color="CBD5E1"/>
-              <w:left w:val="single" w:sz="4" w:color="CBD5E1"/>
-              <w:bottom w:val="single" w:sz="4" w:color="CBD5E1"/>
-              <w:right w:val="single" w:sz="4" w:color="CBD5E1"/>
-            </w:tcBorders>
-          </w:tcPr>
-          <w:p>
-            <w:r>
-              <w:t>TaskFlow — sistema de gestão de tarefas</w:t>
-            </w:r>
-          </w:p>
-        </w:tc>
-      </w:tr>
-      <w:tr>
-        <w:tc>
-          <w:tcPr>
-            <w:tcW w:type="dxa" w:w="2304"/>
-            <w:shd w:fill="E0F2FE"/>
-            <w:tcBorders>
-              <w:top w:val="single" w:sz="4" w:color="CBD5E1"/>
-              <w:left w:val="single" w:sz="4" w:color="CBD5E1"/>
-              <w:bottom w:val="single" w:sz="4" w:color="CBD5E1"/>
-              <w:right w:val="single" w:sz="4" w:color="CBD5E1"/>
-            </w:tcBorders>
-          </w:tcPr>
-          <w:p>
-            <w:r>
-              <w:rPr>
-                <w:b/>
-              </w:rPr>
-              <w:t>Objetivo</w:t>
-            </w:r>
-          </w:p>
-        </w:tc>
-        <w:tc>
-          <w:tcPr>
-            <w:tcW w:type="dxa" w:w="6912"/>
-            <w:tcBorders>
-              <w:top w:val="single" w:sz="4" w:color="CBD5E1"/>
-              <w:left w:val="single" w:sz="4" w:color="CBD5E1"/>
-              <w:bottom w:val="single" w:sz="4" w:color="CBD5E1"/>
-              <w:right w:val="single" w:sz="4" w:color="CBD5E1"/>
-            </w:tcBorders>
-          </w:tcPr>
-          <w:p>
-            <w:r>
-              <w:t>Compreender a estrutura inicial e executar o primeiro servidor</w:t>
-            </w:r>
-          </w:p>
-        </w:tc>
-      </w:tr>
-      <w:tr>
-        <w:tc>
-          <w:tcPr>
-            <w:tcW w:type="dxa" w:w="2304"/>
-            <w:shd w:fill="E0F2FE"/>
-            <w:tcBorders>
-              <w:top w:val="single" w:sz="4" w:color="CBD5E1"/>
-              <w:left w:val="single" w:sz="4" w:color="CBD5E1"/>
-              <w:bottom w:val="single" w:sz="4" w:color="CBD5E1"/>
-              <w:right w:val="single" w:sz="4" w:color="CBD5E1"/>
-            </w:tcBorders>
-          </w:tcPr>
-          <w:p>
-            <w:r>
-              <w:rPr>
-                <w:b/>
-              </w:rPr>
-              <w:t>Pré-requisito</w:t>
-            </w:r>
-          </w:p>
-        </w:tc>
-        <w:tc>
-          <w:tcPr>
-            <w:tcW w:type="dxa" w:w="6912"/>
-            <w:tcBorders>
-              <w:top w:val="single" w:sz="4" w:color="CBD5E1"/>
-              <w:left w:val="single" w:sz="4" w:color="CBD5E1"/>
-              <w:bottom w:val="single" w:sz="4" w:color="CBD5E1"/>
-              <w:right w:val="single" w:sz="4" w:color="CBD5E1"/>
-            </w:tcBorders>
-          </w:tcPr>
-          <w:p>
-            <w:r>
-              <w:t>Conhecimento básico de Python e uso do terminal</w:t>
-            </w:r>
-          </w:p>
-        </w:tc>
-      </w:tr>
-    </w:tbl>
-    <w:p/>
-    <w:p>
-      <w:pPr>
-        <w:jc w:val="center"/>
-      </w:pPr>
-      <w:r>
-        <w:rPr>
-          <w:color w:val="475569"/>
-          <w:sz w:val="20"/>
-        </w:rPr>
-        <w:t>Material de estudo</w:t>
-      </w:r>
-    </w:p>
-    <w:p>
-      <w:r>
-        <w:br w:type="page"/>
-      </w:r>
-    </w:p>
-    <w:p>
-      <w:pPr>
-        <w:pStyle w:val="Heading1"/>
-      </w:pPr>
-      <w:r>
-        <w:t>Como usar esta apostila</w:t>
-      </w:r>
-    </w:p>
-    <w:p>
-      <w:r>
-        <w:t>Esta aula foi pensada para ser executada no computador. Não basta ler os comandos: cria a pasta, executa cada passo, observa o resultado e só depois avança. O objetivo é compreender o Django, não decorar comandos.</w:t>
-      </w:r>
-    </w:p>
-    <w:tbl>
-      <w:tblPr>
-        <w:tblW w:type="auto" w:w="0"/>
-        <w:jc w:val="center"/>
-        <w:tblLook w:firstColumn="1" w:firstRow="1" w:lastColumn="0" w:lastRow="0" w:noHBand="0" w:noVBand="1" w:val="04A0"/>
-      </w:tblPr>
-      <w:tblGrid>
-        <w:gridCol w:w="9792"/>
-      </w:tblGrid>
-      <w:tr>
-        <w:tc>
-          <w:tcPr>
-            <w:tcW w:type="dxa" w:w="9792"/>
-            <w:shd w:fill="E0F2FE"/>
-            <w:tcBorders>
-              <w:top w:val="single" w:sz="6" w:color="93C5FD"/>
-              <w:left w:val="single" w:sz="6" w:color="93C5FD"/>
-              <w:bottom w:val="single" w:sz="6" w:color="93C5FD"/>
-              <w:right w:val="single" w:sz="6" w:color="93C5FD"/>
-            </w:tcBorders>
-          </w:tcPr>
-          <w:p>
-            <w:pPr>
-              <w:spacing w:after="40"/>
-            </w:pPr>
-            <w:r>
-              <w:rPr>
-                <w:b/>
-                <w:color w:val="123B5D"/>
-              </w:rPr>
-              <w:t>Método de aprendizagem</w:t>
-              <w:br/>
-            </w:r>
-            <w:r>
-              <w:t>Em cada etapa vamos seguir três movimentos: compreender o conceito, executar o código e verificar o resultado. Os erros também fazem parte do processo; aprenderemos a lê-los e corrigi-los.</w:t>
-            </w:r>
-          </w:p>
-        </w:tc>
-      </w:tr>
-    </w:tbl>
-    <w:p>
-      <w:pPr>
-        <w:spacing w:after="0"/>
-      </w:pPr>
-    </w:p>
-    <w:p>
-      <w:pPr>
-        <w:pStyle w:val="Heading1"/>
-      </w:pPr>
-      <w:r>
-        <w:t>O projeto que vamos construir</w:t>
-      </w:r>
-    </w:p>
-    <w:p>
-      <w:r>
-        <w:t>Durante o curso vamos criar o TaskFlow, uma aplicação real de gestão de tarefas. Ela começará simples e crescerá progressivamente.</w:t>
-      </w:r>
-    </w:p>
-    <w:p>
-      <w:pPr>
-        <w:pStyle w:val="CodeBlock"/>
-        <w:keepLines/>
-        <w:widowControl/>
-        <w:shd w:fill="F3F4F6"/>
-        <w:pBdr>
-          <w:bottom w:val="single" w:sz="4" w:space="1" w:color="CBD5E1"/>
-        </w:pBdr>
-      </w:pPr>
-      <w:r>
-        <w:rPr>
-          <w:rFonts w:ascii="Consolas" w:hAnsi="Consolas" w:eastAsia="Consolas"/>
-        </w:rPr>
-        <w:t>TaskFlow</w:t>
-        <w:br/>
-        <w:t>├── contas</w:t>
-        <w:br/>
-        <w:t>├── tarefas</w:t>
-        <w:br/>
-        <w:t>├── notificacoes</w:t>
-        <w:br/>
-        <w:t>└── configuracao geral</w:t>
-      </w:r>
-    </w:p>
-    <w:p>
-      <w:r>
-        <w:t>Uma distinção importante:</w:t>
-      </w:r>
-    </w:p>
-    <w:p>
-      <w:pPr>
-        <w:pStyle w:val="ListBullet"/>
-        <w:spacing w:after="40"/>
-      </w:pPr>
-      <w:r>
-        <w:t>Projeto Django: contém a configuração geral da aplicação.</w:t>
-      </w:r>
-    </w:p>
-    <w:p>
-      <w:pPr>
-        <w:pStyle w:val="ListBullet"/>
-        <w:spacing w:after="40"/>
-      </w:pPr>
-      <w:r>
-        <w:t>App Django: contém uma funcionalidade específica, como tarefas, contas ou notificações.</w:t>
-      </w:r>
-    </w:p>
-    <w:p>
-      <w:pPr>
-        <w:pStyle w:val="Heading1"/>
-      </w:pPr>
-      <w:r>
-        <w:t>O que vamos aprender ao longo do curso</w:t>
-      </w:r>
-    </w:p>
-    <w:p>
-      <w:pPr>
-        <w:pStyle w:val="ListNumber"/>
-        <w:spacing w:after="40"/>
-      </w:pPr>
-      <w:r>
-        <w:t>Como a web funciona.</w:t>
-      </w:r>
-    </w:p>
-    <w:p>
-      <w:pPr>
-        <w:pStyle w:val="ListNumber"/>
-        <w:spacing w:after="40"/>
-      </w:pPr>
-      <w:r>
-        <w:t>Instalação e estrutura de um projeto Django.</w:t>
-      </w:r>
-    </w:p>
-    <w:p>
-      <w:pPr>
-        <w:pStyle w:val="ListNumber"/>
-        <w:spacing w:after="40"/>
-      </w:pPr>
-      <w:r>
-        <w:t>Apps, URLs, views e templates.</w:t>
-      </w:r>
-    </w:p>
-    <w:p>
-      <w:pPr>
-        <w:pStyle w:val="ListNumber"/>
-        <w:spacing w:after="40"/>
-      </w:pPr>
-      <w:r>
-        <w:t>Models, base de dados e migrations.</w:t>
-      </w:r>
-    </w:p>
-    <w:p>
-      <w:pPr>
-        <w:pStyle w:val="ListNumber"/>
-        <w:spacing w:after="40"/>
-      </w:pPr>
-      <w:r>
-        <w:t>Django Admin.</w:t>
-      </w:r>
-    </w:p>
-    <w:p>
-      <w:pPr>
-        <w:pStyle w:val="ListNumber"/>
-        <w:spacing w:after="40"/>
-      </w:pPr>
-      <w:r>
-        <w:t>Formulários e validação.</w:t>
-      </w:r>
-    </w:p>
-    <w:p>
-      <w:pPr>
-        <w:pStyle w:val="ListNumber"/>
-        <w:spacing w:after="40"/>
-      </w:pPr>
-      <w:r>
-        <w:t>Autenticação: registo, login e logout.</w:t>
-      </w:r>
-    </w:p>
-    <w:p>
-      <w:pPr>
-        <w:pStyle w:val="ListNumber"/>
-        <w:spacing w:after="40"/>
-      </w:pPr>
-      <w:r>
-        <w:t>Relações entre tabelas.</w:t>
-      </w:r>
-    </w:p>
-    <w:p>
-      <w:pPr>
-        <w:pStyle w:val="ListNumber"/>
-        <w:spacing w:after="40"/>
-      </w:pPr>
-      <w:r>
-        <w:t>Ficheiros estáticos, CSS e imagens.</w:t>
-      </w:r>
-    </w:p>
-    <w:p>
-      <w:pPr>
-        <w:pStyle w:val="ListNumber"/>
-        <w:spacing w:after="40"/>
-      </w:pPr>
-      <w:r>
-        <w:t>Organização profissional do código.</w:t>
-      </w:r>
-    </w:p>
-    <w:p>
-      <w:pPr>
-        <w:pStyle w:val="ListNumber"/>
-        <w:spacing w:after="40"/>
-      </w:pPr>
-      <w:r>
-        <w:t>Testes automáticos.</w:t>
-      </w:r>
-    </w:p>
-    <w:p>
-      <w:pPr>
-        <w:pStyle w:val="ListNumber"/>
-        <w:spacing w:after="40"/>
-      </w:pPr>
-      <w:r>
-        <w:t>Segurança no Django.</w:t>
-      </w:r>
-    </w:p>
-    <w:p>
-      <w:pPr>
-        <w:pStyle w:val="ListNumber"/>
-        <w:spacing w:after="40"/>
-      </w:pPr>
-      <w:r>
-        <w:t>Django REST Framework e APIs.</w:t>
-      </w:r>
-    </w:p>
-    <w:p>
-      <w:pPr>
-        <w:pStyle w:val="ListNumber"/>
-        <w:spacing w:after="40"/>
-      </w:pPr>
-      <w:r>
-        <w:t>JavaScript e HTMX.</w:t>
-      </w:r>
-    </w:p>
-    <w:p>
-      <w:pPr>
-        <w:pStyle w:val="ListNumber"/>
-        <w:spacing w:after="40"/>
-      </w:pPr>
-      <w:r>
-        <w:t>PostgreSQL, Docker e deployment.</w:t>
-      </w:r>
-    </w:p>
-    <w:p>
-      <w:pPr>
-        <w:pStyle w:val="ListNumber"/>
-        <w:spacing w:after="40"/>
-      </w:pPr>
-      <w:r>
-        <w:t>Performance, cache, tarefas assíncronas e arquitetura avançada.</w:t>
-      </w:r>
-    </w:p>
-    <w:p>
-      <w:pPr>
-        <w:pStyle w:val="Heading1"/>
-      </w:pPr>
-      <w:r>
-        <w:t>1. O que é Django?</w:t>
-      </w:r>
-    </w:p>
-    <w:p>
-      <w:r>
-        <w:t>Django é um framework web escrito em Python. Ele ajuda-nos a construir aplicações que recebem pedidos do navegador, processam informação e devolvem páginas ou dados.</w:t>
-      </w:r>
-    </w:p>
-    <w:p>
-      <w:pPr>
-        <w:jc w:val="center"/>
-      </w:pPr>
-      <w:r>
-        <w:drawing>
-          <wp:inline xmlns:a="http://schemas.openxmlformats.org/drawingml/2006/main" xmlns:pic="http://schemas.openxmlformats.org/drawingml/2006/picture">
-            <wp:extent cx="5989320" cy="3443859"/>
-            <wp:docPr id="1" name="Picture 1"/>
-            <wp:cNvGraphicFramePr>
-              <a:graphicFrameLocks noChangeAspect="1"/>
-            </wp:cNvGraphicFramePr>
-            <a:graphic>
-              <a:graphicData uri="http://schemas.openxmlformats.org/drawingml/2006/picture">
-                <pic:pic>
-                  <pic:nvPicPr>
-                    <pic:cNvPr id="0" name="aula_1_fluxo_django.png"/>
-                    <pic:cNvPicPr/>
-                  </pic:nvPicPr>
-                  <pic:blipFill>
-                    <a:blip r:embed="rId10"/>
-                    <a:stretch>
-                      <a:fillRect/>
-                    </a:stretch>
-                  </pic:blipFill>
-                  <pic:spPr>
-                    <a:xfrm>
-                      <a:off x="0" y="0"/>
-                      <a:ext cx="5989320" cy="3443859"/>
-                    </a:xfrm>
-                    <a:prstGeom prst="rect"/>
-                  </pic:spPr>
-                </pic:pic>
-              </a:graphicData>
-            </a:graphic>
-          </wp:inline>
-        </w:drawing>
-      </w:r>
-    </w:p>
-    <w:p>
-      <w:pPr>
-        <w:jc w:val="center"/>
-      </w:pPr>
-      <w:r>
-        <w:rPr>
-          <w:i/>
-          <w:color w:val="475569"/>
-          <w:sz w:val="18"/>
-        </w:rPr>
-        <w:t>Figura 1 — Percurso simplificado de um pedido dentro de uma aplicação Django.</w:t>
-      </w:r>
-    </w:p>
-    <w:p>
-      <w:r>
-        <w:t>A sequência mental que deves guardar é: o navegador envia um pedido; o Django encontra a rota; uma view executa a lógica; a aplicação pode consultar a base de dados; um template gera HTML; e o navegador apresenta a resposta.</w:t>
-      </w:r>
-    </w:p>
-    <w:p>
-      <w:pPr>
-        <w:pStyle w:val="Heading1"/>
-      </w:pPr>
-      <w:r>
-        <w:t>2. Verificar o Python</w:t>
-      </w:r>
-    </w:p>
-    <w:p>
-      <w:r>
-        <w:t>Abre o terminal e verifica se o Python está instalado:</w:t>
-      </w:r>
-    </w:p>
-    <w:p>
-      <w:pPr>
-        <w:pStyle w:val="CodeBlock"/>
-        <w:keepLines/>
-        <w:widowControl/>
-        <w:shd w:fill="F3F4F6"/>
-        <w:pBdr>
-          <w:bottom w:val="single" w:sz="4" w:space="1" w:color="CBD5E1"/>
-        </w:pBdr>
-      </w:pPr>
-      <w:r>
-        <w:rPr>
-          <w:rFonts w:ascii="Consolas" w:hAnsi="Consolas" w:eastAsia="Consolas"/>
-        </w:rPr>
-        <w:t>python --version</w:t>
-      </w:r>
-    </w:p>
-    <w:p>
-      <w:r>
-        <w:t>Se esse comando não funcionar, tenta:</w:t>
-      </w:r>
-    </w:p>
-    <w:p>
-      <w:pPr>
-        <w:pStyle w:val="CodeBlock"/>
-        <w:keepLines/>
-        <w:widowControl/>
-        <w:shd w:fill="F3F4F6"/>
-        <w:pBdr>
-          <w:bottom w:val="single" w:sz="4" w:space="1" w:color="CBD5E1"/>
-        </w:pBdr>
-      </w:pPr>
-      <w:r>
-        <w:rPr>
-          <w:rFonts w:ascii="Consolas" w:hAnsi="Consolas" w:eastAsia="Consolas"/>
-        </w:rPr>
-        <w:t>python3 --version</w:t>
-      </w:r>
-    </w:p>
-    <w:tbl>
-      <w:tblPr>
-        <w:tblW w:type="auto" w:w="0"/>
-        <w:jc w:val="center"/>
-        <w:tblLook w:firstColumn="1" w:firstRow="1" w:lastColumn="0" w:lastRow="0" w:noHBand="0" w:noVBand="1" w:val="04A0"/>
-      </w:tblPr>
-      <w:tblGrid>
-        <w:gridCol w:w="9792"/>
-      </w:tblGrid>
-      <w:tr>
-        <w:tc>
-          <w:tcPr>
-            <w:tcW w:type="dxa" w:w="9792"/>
-            <w:shd w:fill="E0F2FE"/>
-            <w:tcBorders>
-              <w:top w:val="single" w:sz="6" w:color="93C5FD"/>
-              <w:left w:val="single" w:sz="6" w:color="93C5FD"/>
-              <w:bottom w:val="single" w:sz="6" w:color="93C5FD"/>
-              <w:right w:val="single" w:sz="6" w:color="93C5FD"/>
-            </w:tcBorders>
-          </w:tcPr>
-          <w:p>
-            <w:pPr>
-              <w:spacing w:after="40"/>
-            </w:pPr>
-            <w:r>
-              <w:rPr>
-                <w:b/>
-                <w:color w:val="123B5D"/>
-              </w:rPr>
-              <w:t>Atenção</w:t>
-              <w:br/>
-            </w:r>
-            <w:r>
-              <w:t>No Windows, o comando costuma ser python. Em Linux e macOS, pode ser necessário usar python3. Ao longo da aula, substitui python por python3 quando for esse o comando que funciona no teu computador.</w:t>
-            </w:r>
-          </w:p>
-        </w:tc>
-      </w:tr>
-    </w:tbl>
-    <w:p>
-      <w:pPr>
-        <w:spacing w:after="0"/>
-      </w:pPr>
-    </w:p>
-    <w:p>
-      <w:pPr>
-        <w:pStyle w:val="Heading1"/>
-      </w:pPr>
-      <w:r>
-        <w:t>3. Criar a pasta do projeto</w:t>
-      </w:r>
-    </w:p>
-    <w:p>
-      <w:r>
-        <w:t>Cria a pasta que vai conter o TaskFlow e entra nela:</w:t>
-      </w:r>
-    </w:p>
-    <w:p>
-      <w:pPr>
-        <w:pStyle w:val="CodeBlock"/>
-        <w:keepLines/>
-        <w:widowControl/>
-        <w:shd w:fill="F3F4F6"/>
-        <w:pBdr>
-          <w:bottom w:val="single" w:sz="4" w:space="1" w:color="CBD5E1"/>
-        </w:pBdr>
-      </w:pPr>
-      <w:r>
-        <w:rPr>
-          <w:rFonts w:ascii="Consolas" w:hAnsi="Consolas" w:eastAsia="Consolas"/>
-        </w:rPr>
-        <w:t>mkdir taskflow</w:t>
-        <w:br/>
-        <w:t>cd taskflow</w:t>
-      </w:r>
-    </w:p>
-    <w:p>
-      <w:r>
-        <w:t>No Linux e macOS, podes confirmar a pasta atual com:</w:t>
-      </w:r>
-    </w:p>
-    <w:p>
-      <w:pPr>
-        <w:pStyle w:val="CodeBlock"/>
-        <w:keepLines/>
-        <w:widowControl/>
-        <w:shd w:fill="F3F4F6"/>
-        <w:pBdr>
-          <w:bottom w:val="single" w:sz="4" w:space="1" w:color="CBD5E1"/>
-        </w:pBdr>
-      </w:pPr>
-      <w:r>
-        <w:rPr>
-          <w:rFonts w:ascii="Consolas" w:hAnsi="Consolas" w:eastAsia="Consolas"/>
-        </w:rPr>
-        <w:t>pwd</w:t>
-      </w:r>
-    </w:p>
-    <w:p>
-      <w:r>
-        <w:t>No Windows PowerShell:</w:t>
-      </w:r>
-    </w:p>
-    <w:p>
-      <w:pPr>
-        <w:pStyle w:val="CodeBlock"/>
-        <w:keepLines/>
-        <w:widowControl/>
-        <w:shd w:fill="F3F4F6"/>
-        <w:pBdr>
-          <w:bottom w:val="single" w:sz="4" w:space="1" w:color="CBD5E1"/>
-        </w:pBdr>
-      </w:pPr>
-      <w:r>
-        <w:rPr>
-          <w:rFonts w:ascii="Consolas" w:hAnsi="Consolas" w:eastAsia="Consolas"/>
-        </w:rPr>
-        <w:t>Get-Location</w:t>
-      </w:r>
-    </w:p>
-    <w:p>
-      <w:pPr>
-        <w:pStyle w:val="Heading1"/>
-      </w:pPr>
-      <w:r>
-        <w:t>4. Criar um ambiente virtual</w:t>
-      </w:r>
-    </w:p>
-    <w:p>
-      <w:r>
-        <w:t>Um ambiente virtual isola as bibliotecas deste projeto. Assim, uma versão de Django usada pelo TaskFlow não entra em conflito com as bibliotecas de outros projetos.</w:t>
-      </w:r>
-    </w:p>
-    <w:p>
-      <w:pPr>
-        <w:pStyle w:val="CodeBlock"/>
-        <w:keepLines/>
-        <w:widowControl/>
-        <w:shd w:fill="F3F4F6"/>
-        <w:pBdr>
-          <w:bottom w:val="single" w:sz="4" w:space="1" w:color="CBD5E1"/>
-        </w:pBdr>
-      </w:pPr>
-      <w:r>
-        <w:rPr>
-          <w:rFonts w:ascii="Consolas" w:hAnsi="Consolas" w:eastAsia="Consolas"/>
-        </w:rPr>
-        <w:t>python -m venv .venv</w:t>
-      </w:r>
-    </w:p>
-    <w:p>
-      <w:r>
-        <w:t>Ativa o ambiente virtual conforme o teu sistema:</w:t>
-      </w:r>
-    </w:p>
-    <w:p>
-      <w:pPr>
-        <w:pStyle w:val="CodeBlock"/>
-        <w:keepLines/>
-        <w:widowControl/>
-        <w:shd w:fill="F3F4F6"/>
-        <w:pBdr>
-          <w:bottom w:val="single" w:sz="4" w:space="1" w:color="CBD5E1"/>
-        </w:pBdr>
-      </w:pPr>
-      <w:r>
-        <w:rPr>
-          <w:rFonts w:ascii="Consolas" w:hAnsi="Consolas" w:eastAsia="Consolas"/>
-        </w:rPr>
-        <w:t># Linux ou macOS</w:t>
-        <w:br/>
-        <w:t>source .venv/bin/activate</w:t>
-        <w:br/>
-        <w:br/>
-        <w:t># Windows PowerShell</w:t>
-        <w:br/>
-        <w:t>.venv\Scripts\Activate.ps1</w:t>
-        <w:br/>
-        <w:br/>
-        <w:t># Windows CMD</w:t>
-        <w:br/>
-        <w:t>.venv\Scripts\activate.bat</w:t>
-      </w:r>
-    </w:p>
-    <w:p>
-      <w:r>
-        <w:t>Quando estiver ativo, normalmente verás `(.venv)` no início da linha do terminal:</w:t>
-      </w:r>
-    </w:p>
-    <w:p>
-      <w:pPr>
-        <w:pStyle w:val="CodeBlock"/>
-        <w:keepLines/>
-        <w:widowControl/>
-        <w:shd w:fill="F3F4F6"/>
-        <w:pBdr>
-          <w:bottom w:val="single" w:sz="4" w:space="1" w:color="CBD5E1"/>
-        </w:pBdr>
-      </w:pPr>
-      <w:r>
-        <w:rPr>
-          <w:rFonts w:ascii="Consolas" w:hAnsi="Consolas" w:eastAsia="Consolas"/>
-        </w:rPr>
-        <w:t>(.venv) user@computador:~/taskflow$</w:t>
-      </w:r>
-    </w:p>
-    <w:tbl>
-      <w:tblPr>
-        <w:tblW w:type="auto" w:w="0"/>
-        <w:jc w:val="center"/>
-        <w:tblLook w:firstColumn="1" w:firstRow="1" w:lastColumn="0" w:lastRow="0" w:noHBand="0" w:noVBand="1" w:val="04A0"/>
-      </w:tblPr>
-      <w:tblGrid>
-        <w:gridCol w:w="9792"/>
-      </w:tblGrid>
-      <w:tr>
-        <w:tc>
-          <w:tcPr>
-            <w:tcW w:type="dxa" w:w="9792"/>
-            <w:shd w:fill="E0F2FE"/>
-            <w:tcBorders>
-              <w:top w:val="single" w:sz="6" w:color="93C5FD"/>
-              <w:left w:val="single" w:sz="6" w:color="93C5FD"/>
-              <w:bottom w:val="single" w:sz="6" w:color="93C5FD"/>
-              <w:right w:val="single" w:sz="6" w:color="93C5FD"/>
-            </w:tcBorders>
-          </w:tcPr>
-          <w:p>
-            <w:pPr>
-              <w:spacing w:after="40"/>
-            </w:pPr>
-            <w:r>
-              <w:rPr>
-                <w:b/>
-                <w:color w:val="123B5D"/>
-              </w:rPr>
-              <w:t>Por que isto é importante?</w:t>
-              <w:br/>
-            </w:r>
-            <w:r>
-              <w:t>O prefixo (.venv) indica que os comandos de instalação serão aplicados ao ambiente deste projeto. É uma prática profissional e evita muitos problemas de dependências.</w:t>
-            </w:r>
-          </w:p>
-        </w:tc>
-      </w:tr>
-    </w:tbl>
-    <w:p>
-      <w:pPr>
-        <w:spacing w:after="0"/>
-      </w:pPr>
-    </w:p>
-    <w:p>
-      <w:pPr>
-        <w:pStyle w:val="Heading1"/>
-      </w:pPr>
-      <w:r>
-        <w:t>5. Instalar Django</w:t>
-      </w:r>
-    </w:p>
-    <w:p>
-      <w:r>
-        <w:t>Com o ambiente virtual ativo, instala o Django:</w:t>
-      </w:r>
-    </w:p>
-    <w:p>
-      <w:pPr>
-        <w:pStyle w:val="CodeBlock"/>
-        <w:keepLines/>
-        <w:widowControl/>
-        <w:shd w:fill="F3F4F6"/>
-        <w:pBdr>
-          <w:bottom w:val="single" w:sz="4" w:space="1" w:color="CBD5E1"/>
-        </w:pBdr>
-      </w:pPr>
-      <w:r>
-        <w:rPr>
-          <w:rFonts w:ascii="Consolas" w:hAnsi="Consolas" w:eastAsia="Consolas"/>
-        </w:rPr>
-        <w:t>python -m pip install django</w:t>
-      </w:r>
-    </w:p>
-    <w:p>
-      <w:r>
-        <w:t>Verifica a versão instalada:</w:t>
-      </w:r>
-    </w:p>
-    <w:p>
-      <w:pPr>
-        <w:pStyle w:val="CodeBlock"/>
-        <w:keepLines/>
-        <w:widowControl/>
-        <w:shd w:fill="F3F4F6"/>
-        <w:pBdr>
-          <w:bottom w:val="single" w:sz="4" w:space="1" w:color="CBD5E1"/>
-        </w:pBdr>
-      </w:pPr>
-      <w:r>
-        <w:rPr>
-          <w:rFonts w:ascii="Consolas" w:hAnsi="Consolas" w:eastAsia="Consolas"/>
-        </w:rPr>
-        <w:t>python -m django --version</w:t>
-      </w:r>
-    </w:p>
-    <w:p>
-      <w:r>
-        <w:t>Guarda as dependências do projeto num ficheiro:</w:t>
-      </w:r>
-    </w:p>
-    <w:p>
-      <w:pPr>
-        <w:pStyle w:val="CodeBlock"/>
-        <w:keepLines/>
-        <w:widowControl/>
-        <w:shd w:fill="F3F4F6"/>
-        <w:pBdr>
-          <w:bottom w:val="single" w:sz="4" w:space="1" w:color="CBD5E1"/>
-        </w:pBdr>
-      </w:pPr>
-      <w:r>
-        <w:rPr>
-          <w:rFonts w:ascii="Consolas" w:hAnsi="Consolas" w:eastAsia="Consolas"/>
-        </w:rPr>
-        <w:t>python -m pip freeze &gt; requirements.txt</w:t>
-      </w:r>
-    </w:p>
-    <w:p>
-      <w:r>
-        <w:t>O ficheiro `requirements.txt` permitirá instalar as mesmas bibliotecas noutro computador ou num servidor.</w:t>
-      </w:r>
-    </w:p>
-    <w:p>
-      <w:pPr>
-        <w:pStyle w:val="Heading1"/>
-      </w:pPr>
-      <w:r>
-        <w:t>6. Criar o projeto Django</w:t>
-      </w:r>
-    </w:p>
-    <w:p>
-      <w:r>
-        <w:t>Executa o comando seguinte dentro da pasta `taskflow`:</w:t>
-      </w:r>
-    </w:p>
-    <w:p>
-      <w:pPr>
-        <w:pStyle w:val="CodeBlock"/>
-        <w:keepLines/>
-        <w:widowControl/>
-        <w:shd w:fill="F3F4F6"/>
-        <w:pBdr>
-          <w:bottom w:val="single" w:sz="4" w:space="1" w:color="CBD5E1"/>
-        </w:pBdr>
-      </w:pPr>
-      <w:r>
-        <w:rPr>
-          <w:rFonts w:ascii="Consolas" w:hAnsi="Consolas" w:eastAsia="Consolas"/>
-        </w:rPr>
-        <w:t>django-admin startproject config .</w:t>
-      </w:r>
-    </w:p>
-    <w:p>
-      <w:r>
-        <w:t>O ponto final `.` é importante: ele diz ao Django para criar o projeto na pasta atual, evitando uma pasta duplicada.</w:t>
-      </w:r>
-    </w:p>
-    <w:p>
-      <w:r>
-        <w:t>A estrutura inicial ficará assim:</w:t>
-      </w:r>
-    </w:p>
-    <w:p>
-      <w:pPr>
-        <w:pStyle w:val="CodeBlock"/>
-        <w:keepLines/>
-        <w:widowControl/>
-        <w:shd w:fill="F3F4F6"/>
-        <w:pBdr>
-          <w:bottom w:val="single" w:sz="4" w:space="1" w:color="CBD5E1"/>
-        </w:pBdr>
-      </w:pPr>
-      <w:r>
-        <w:rPr>
-          <w:rFonts w:ascii="Consolas" w:hAnsi="Consolas" w:eastAsia="Consolas"/>
-        </w:rPr>
-        <w:t>taskflow/</w:t>
-        <w:br/>
-        <w:t>├── .venv/</w:t>
-        <w:br/>
-        <w:t>├── manage.py</w:t>
-        <w:br/>
-        <w:t>├── requirements.txt</w:t>
-        <w:br/>
-        <w:t>└── config/</w:t>
-        <w:br/>
-        <w:t xml:space="preserve">    ├── __init__.py</w:t>
-        <w:br/>
-        <w:t xml:space="preserve">    ├── settings.py</w:t>
-        <w:br/>
-        <w:t xml:space="preserve">    ├── urls.py</w:t>
-        <w:br/>
-        <w:t xml:space="preserve">    ├── asgi.py</w:t>
-        <w:br/>
-        <w:t xml:space="preserve">    └── wsgi.py</w:t>
-      </w:r>
-    </w:p>
-    <w:p>
-      <w:pPr>
-        <w:pStyle w:val="Heading2"/>
-      </w:pPr>
-      <w:r>
-        <w:t>Para que serve cada ficheiro?</w:t>
-      </w:r>
-    </w:p>
-    <w:p>
-      <w:pPr>
-        <w:pStyle w:val="ListBullet"/>
-        <w:spacing w:after="40"/>
-      </w:pPr>
-      <w:r>
-        <w:t>`manage.py`: principal comando administrativo do projeto. Será usado para iniciar o servidor, criar apps, executar migrations, criar utilizadores e correr testes.</w:t>
-      </w:r>
-    </w:p>
-    <w:p>
-      <w:pPr>
-        <w:pStyle w:val="ListBullet"/>
-        <w:spacing w:after="40"/>
-      </w:pPr>
-      <w:r>
-        <w:t>`config/settings.py`: configurações gerais, como apps instaladas, base de dados, idioma, fuso horário, ficheiros estáticos e segurança.</w:t>
-      </w:r>
-    </w:p>
-    <w:p>
-      <w:pPr>
-        <w:pStyle w:val="ListBullet"/>
-        <w:spacing w:after="40"/>
-      </w:pPr>
-      <w:r>
-        <w:t>`config/urls.py`: mapa principal das URLs da aplicação.</w:t>
-      </w:r>
-    </w:p>
-    <w:p>
-      <w:pPr>
-        <w:pStyle w:val="ListBullet"/>
-        <w:spacing w:after="40"/>
-      </w:pPr>
-      <w:r>
-        <w:t>`config/asgi.py`: ponto de entrada para servidores modernos que suportam comunicação assíncrona.</w:t>
-      </w:r>
-    </w:p>
-    <w:p>
-      <w:pPr>
-        <w:pStyle w:val="ListBullet"/>
-        <w:spacing w:after="40"/>
-      </w:pPr>
-      <w:r>
-        <w:t>`config/wsgi.py`: ponto de entrada para servidores web tradicionais compatíveis com WSGI.</w:t>
-      </w:r>
-    </w:p>
-    <w:p>
-      <w:pPr>
-        <w:pStyle w:val="ListBullet"/>
-        <w:spacing w:after="40"/>
-      </w:pPr>
-      <w:r>
-        <w:t>`__init__.py`: indica ao Python que a pasta pode ser tratada como um pacote.</w:t>
-      </w:r>
-    </w:p>
-    <w:p>
-      <w:pPr>
-        <w:pStyle w:val="Heading1"/>
-      </w:pPr>
-      <w:r>
-        <w:t>7. Criar a base de dados inicial</w:t>
-      </w:r>
-    </w:p>
-    <w:p>
-      <w:r>
-        <w:t>O Django já vem preparado para usar SQLite durante o desenvolvimento. Executa:</w:t>
-      </w:r>
-    </w:p>
-    <w:p>
-      <w:pPr>
-        <w:pStyle w:val="CodeBlock"/>
-        <w:keepLines/>
-        <w:widowControl/>
-        <w:shd w:fill="F3F4F6"/>
-        <w:pBdr>
-          <w:bottom w:val="single" w:sz="4" w:space="1" w:color="CBD5E1"/>
-        </w:pBdr>
-      </w:pPr>
-      <w:r>
-        <w:rPr>
-          <w:rFonts w:ascii="Consolas" w:hAnsi="Consolas" w:eastAsia="Consolas"/>
-        </w:rPr>
-        <w:t>python manage.py migrate</w:t>
-      </w:r>
-    </w:p>
-    <w:p>
-      <w:r>
-        <w:t>Deverás ver várias linhas semelhantes a estas:</w:t>
-      </w:r>
-    </w:p>
-    <w:p>
-      <w:pPr>
-        <w:pStyle w:val="CodeBlock"/>
-        <w:keepLines/>
-        <w:widowControl/>
-        <w:shd w:fill="F3F4F6"/>
-        <w:pBdr>
-          <w:bottom w:val="single" w:sz="4" w:space="1" w:color="CBD5E1"/>
-        </w:pBdr>
-      </w:pPr>
-      <w:r>
-        <w:rPr>
-          <w:rFonts w:ascii="Consolas" w:hAnsi="Consolas" w:eastAsia="Consolas"/>
-        </w:rPr>
-        <w:t>Applying contenttypes.0001_initial... OK</w:t>
-        <w:br/>
-        <w:t>Applying auth.0001_initial... OK</w:t>
-        <w:br/>
-        <w:t>Applying admin.0001_initial... OK</w:t>
-        <w:br/>
-        <w:t>Applying sessions.0001_initial... OK</w:t>
-      </w:r>
-    </w:p>
-    <w:p>
-      <w:r>
-        <w:t>Agora aparecerá o ficheiro `db.sqlite3`:</w:t>
-      </w:r>
-    </w:p>
-    <w:p>
-      <w:pPr>
-        <w:pStyle w:val="CodeBlock"/>
-        <w:keepLines/>
-        <w:widowControl/>
-        <w:shd w:fill="F3F4F6"/>
-        <w:pBdr>
-          <w:bottom w:val="single" w:sz="4" w:space="1" w:color="CBD5E1"/>
-        </w:pBdr>
-      </w:pPr>
-      <w:r>
-        <w:rPr>
-          <w:rFonts w:ascii="Consolas" w:hAnsi="Consolas" w:eastAsia="Consolas"/>
-        </w:rPr>
-        <w:t>taskflow/</w:t>
-        <w:br/>
-        <w:t>├── .venv/</w:t>
-        <w:br/>
-        <w:t>├── config/</w:t>
-        <w:br/>
-        <w:t>├── db.sqlite3</w:t>
-        <w:br/>
-        <w:t>├── manage.py</w:t>
-        <w:br/>
-        <w:t>└── requirements.txt</w:t>
-      </w:r>
-    </w:p>
-    <w:p>
-      <w:r>
-        <w:t>O Django criou tabelas internas para utilizadores, grupos, permissões, sessões e o painel administrativo. Ainda não criámos a tabela de tarefas; isso acontecerá quando criarmos o nosso primeiro model.</w:t>
-      </w:r>
-    </w:p>
-    <w:p>
-      <w:pPr>
-        <w:pStyle w:val="Heading1"/>
-      </w:pPr>
-      <w:r>
-        <w:t>8. Iniciar o servidor</w:t>
-      </w:r>
-    </w:p>
-    <w:p>
-      <w:r>
-        <w:t>Executa:</w:t>
-      </w:r>
-    </w:p>
-    <w:p>
-      <w:pPr>
-        <w:pStyle w:val="CodeBlock"/>
-        <w:keepLines/>
-        <w:widowControl/>
-        <w:shd w:fill="F3F4F6"/>
-        <w:pBdr>
-          <w:bottom w:val="single" w:sz="4" w:space="1" w:color="CBD5E1"/>
-        </w:pBdr>
-      </w:pPr>
-      <w:r>
-        <w:rPr>
-          <w:rFonts w:ascii="Consolas" w:hAnsi="Consolas" w:eastAsia="Consolas"/>
-        </w:rPr>
-        <w:t>python manage.py runserver</w:t>
-      </w:r>
-    </w:p>
-    <w:p>
-      <w:r>
-        <w:t>O terminal deverá mostrar algo semelhante a:</w:t>
-      </w:r>
-    </w:p>
-    <w:p>
-      <w:pPr>
-        <w:pStyle w:val="CodeBlock"/>
-        <w:keepLines/>
-        <w:widowControl/>
-        <w:shd w:fill="F3F4F6"/>
-        <w:pBdr>
-          <w:bottom w:val="single" w:sz="4" w:space="1" w:color="CBD5E1"/>
-        </w:pBdr>
-      </w:pPr>
-      <w:r>
-        <w:rPr>
-          <w:rFonts w:ascii="Consolas" w:hAnsi="Consolas" w:eastAsia="Consolas"/>
-        </w:rPr>
-        <w:t>Starting development server at http://127.0.0.1:8000/</w:t>
-        <w:br/>
-        <w:t>Quit the server with CONTROL-C.</w:t>
-      </w:r>
-    </w:p>
-    <w:p>
-      <w:r>
-        <w:t>Abre no navegador:</w:t>
-      </w:r>
-    </w:p>
-    <w:p>
-      <w:pPr>
-        <w:pStyle w:val="CodeBlock"/>
-        <w:keepLines/>
-        <w:widowControl/>
-        <w:shd w:fill="F3F4F6"/>
-        <w:pBdr>
-          <w:bottom w:val="single" w:sz="4" w:space="1" w:color="CBD5E1"/>
-        </w:pBdr>
-      </w:pPr>
-      <w:r>
-        <w:rPr>
-          <w:rFonts w:ascii="Consolas" w:hAnsi="Consolas" w:eastAsia="Consolas"/>
-        </w:rPr>
-        <w:t>http://127.0.0.1:8000/</w:t>
-      </w:r>
-    </w:p>
-    <w:p>
-      <w:r>
-        <w:t>Deverás ver a página inicial do Django com uma mensagem semelhante a “The install worked successfully!”. Isso confirma que o Python, o Django, o projeto, as configurações e o servidor estão a funcionar.</w:t>
-      </w:r>
-    </w:p>
-    <w:p>
-      <w:r>
-        <w:t>Para parar o servidor, usa:</w:t>
-      </w:r>
-    </w:p>
-    <w:p>
-      <w:pPr>
-        <w:pStyle w:val="CodeBlock"/>
-        <w:keepLines/>
-        <w:widowControl/>
-        <w:shd w:fill="F3F4F6"/>
-        <w:pBdr>
-          <w:bottom w:val="single" w:sz="4" w:space="1" w:color="CBD5E1"/>
-        </w:pBdr>
-      </w:pPr>
-      <w:r>
-        <w:rPr>
-          <w:rFonts w:ascii="Consolas" w:hAnsi="Consolas" w:eastAsia="Consolas"/>
-        </w:rPr>
-        <w:t>CTRL + C</w:t>
-      </w:r>
-    </w:p>
-    <w:p>
-      <w:pPr>
-        <w:pStyle w:val="Heading1"/>
-      </w:pPr>
-      <w:r>
-        <w:t>O que aconteceu por trás dos bastidores?</w:t>
-      </w:r>
-    </w:p>
-    <w:p>
-      <w:r>
-        <w:t>Quando abriste `http://127.0.0.1:8000/`, o navegador enviou um pedido HTTP semelhante a:</w:t>
-      </w:r>
-    </w:p>
-    <w:p>
-      <w:pPr>
-        <w:pStyle w:val="CodeBlock"/>
-        <w:keepLines/>
-        <w:widowControl/>
-        <w:shd w:fill="F3F4F6"/>
-        <w:pBdr>
-          <w:bottom w:val="single" w:sz="4" w:space="1" w:color="CBD5E1"/>
-        </w:pBdr>
-      </w:pPr>
-      <w:r>
-        <w:rPr>
-          <w:rFonts w:ascii="Consolas" w:hAnsi="Consolas" w:eastAsia="Consolas"/>
-        </w:rPr>
-        <w:t>GET /</w:t>
-      </w:r>
-    </w:p>
-    <w:p>
-      <w:r>
-        <w:t>O Django recebeu o pedido e consultou `config/urls.py`. Como ainda não definimos uma página inicial própria, mostrou a página padrão de instalação.</w:t>
-      </w:r>
-    </w:p>
-    <w:p>
-      <w:pPr>
-        <w:pStyle w:val="CodeBlock"/>
-        <w:keepLines/>
-        <w:widowControl/>
-        <w:shd w:fill="F3F4F6"/>
-        <w:pBdr>
-          <w:bottom w:val="single" w:sz="4" w:space="1" w:color="CBD5E1"/>
-        </w:pBdr>
-      </w:pPr>
-      <w:r>
-        <w:rPr>
-          <w:rFonts w:ascii="Consolas" w:hAnsi="Consolas" w:eastAsia="Consolas"/>
-        </w:rPr>
-        <w:t>GET /  →  URL definida em urls.py</w:t>
-        <w:br/>
-        <w:t xml:space="preserve">      →  View em Python</w:t>
-        <w:br/>
-        <w:t xml:space="preserve">      →  Consulta às tarefas, quando necessário</w:t>
-        <w:br/>
-        <w:t xml:space="preserve">      →  Template HTML</w:t>
-        <w:br/>
-        <w:t xml:space="preserve">      →  Página apresentada no navegador</w:t>
-      </w:r>
-    </w:p>
-    <w:p>
-      <w:pPr>
-        <w:pStyle w:val="Heading1"/>
-      </w:pPr>
-      <w:r>
-        <w:t>Primeira regra profissional: usa o ambiente virtual</w:t>
-      </w:r>
-    </w:p>
-    <w:p>
-      <w:r>
-        <w:t>Antes de executar comandos Django ou instalar bibliotecas, confirma que o ambiente virtual está ativo. Caso contrário, podes instalar pacotes no local errado e acabar com versões incompatíveis.</w:t>
-      </w:r>
-    </w:p>
-    <w:p>
-      <w:r>
-        <w:t>Também não devemos colocar a pasta `.venv` ou a base de dados local no Git. Cria um ficheiro chamado `.gitignore` na pasta principal:</w:t>
-      </w:r>
-    </w:p>
-    <w:p>
-      <w:pPr>
-        <w:pStyle w:val="CodeBlock"/>
-        <w:keepLines/>
-        <w:widowControl/>
-        <w:shd w:fill="F3F4F6"/>
-        <w:pBdr>
-          <w:bottom w:val="single" w:sz="4" w:space="1" w:color="CBD5E1"/>
-        </w:pBdr>
-      </w:pPr>
-      <w:r>
-        <w:rPr>
-          <w:rFonts w:ascii="Consolas" w:hAnsi="Consolas" w:eastAsia="Consolas"/>
-        </w:rPr>
-        <w:t>.venv/</w:t>
-        <w:br/>
-        <w:t>__pycache__/</w:t>
-        <w:br/>
-        <w:t>*.pyc</w:t>
-        <w:br/>
-        <w:t>db.sqlite3</w:t>
-        <w:br/>
-        <w:t>.env</w:t>
-      </w:r>
-    </w:p>
-    <w:p>
-      <w:r>
-        <w:t>Mais tarde, quando publicarmos a aplicação, vamos usar PostgreSQL e variáveis de ambiente para os dados sensíveis.</w:t>
-      </w:r>
-    </w:p>
-    <w:p>
-      <w:pPr>
-        <w:pStyle w:val="Heading1"/>
-      </w:pPr>
-      <w:r>
-        <w:t>Checklist da Aula 1</w:t>
-      </w:r>
-    </w:p>
-    <w:tbl>
-      <w:tblPr>
-        <w:tblStyle w:val="TableGrid"/>
-        <w:tblW w:type="auto" w:w="0"/>
-        <w:jc w:val="center"/>
-        <w:tblLook w:firstColumn="1" w:firstRow="1" w:lastColumn="0" w:lastRow="0" w:noHBand="0" w:noVBand="1" w:val="04A0"/>
-      </w:tblPr>
-      <w:tblGrid>
-        <w:gridCol w:w="4896"/>
-        <w:gridCol w:w="4896"/>
-      </w:tblGrid>
-      <w:tr>
-        <w:tc>
-          <w:tcPr>
-            <w:tcW w:type="dxa" w:w="4896"/>
-            <w:shd w:fill="123B5D"/>
-          </w:tcPr>
-          <w:p>
-            <w:r>
-              <w:rPr>
-                <w:b/>
-                <w:color w:val="FFFFFF"/>
-              </w:rPr>
-              <w:t>Verificação</w:t>
-            </w:r>
-          </w:p>
-        </w:tc>
-        <w:tc>
-          <w:tcPr>
-            <w:tcW w:type="dxa" w:w="4896"/>
-            <w:shd w:fill="123B5D"/>
-          </w:tcPr>
-          <w:p>
-            <w:r>
-              <w:rPr>
-                <w:b/>
-                <w:color w:val="FFFFFF"/>
-              </w:rPr>
-              <w:t>Concluído</w:t>
-            </w:r>
-          </w:p>
-        </w:tc>
-      </w:tr>
-      <w:tr>
-        <w:tc>
-          <w:tcPr>
-            <w:tcW w:type="dxa" w:w="4896"/>
-          </w:tcPr>
-          <w:p>
-            <w:r>
-              <w:t>O comando python --version funciona.</w:t>
-            </w:r>
-          </w:p>
-        </w:tc>
-        <w:tc>
-          <w:tcPr>
-            <w:tcW w:type="dxa" w:w="4896"/>
-          </w:tcPr>
-          <w:p>
-            <w:pPr>
-              <w:jc w:val="center"/>
-            </w:pPr>
-            <w:r>
-              <w:t>☐</w:t>
-            </w:r>
-          </w:p>
-        </w:tc>
-      </w:tr>
-      <w:tr>
-        <w:tc>
-          <w:tcPr>
-            <w:tcW w:type="dxa" w:w="4896"/>
-          </w:tcPr>
-          <w:p>
-            <w:r>
-              <w:t>O ambiente virtual foi criado e ativado.</w:t>
-            </w:r>
-          </w:p>
-        </w:tc>
-        <w:tc>
-          <w:tcPr>
-            <w:tcW w:type="dxa" w:w="4896"/>
-          </w:tcPr>
-          <w:p>
-            <w:pPr>
-              <w:jc w:val="center"/>
-            </w:pPr>
-            <w:r>
-              <w:t>☐</w:t>
-            </w:r>
-          </w:p>
-        </w:tc>
-      </w:tr>
-      <w:tr>
-        <w:tc>
-          <w:tcPr>
-            <w:tcW w:type="dxa" w:w="4896"/>
-          </w:tcPr>
-          <w:p>
-            <w:r>
-              <w:t>O Django foi instalado.</w:t>
-            </w:r>
-          </w:p>
-        </w:tc>
-        <w:tc>
-          <w:tcPr>
-            <w:tcW w:type="dxa" w:w="4896"/>
-          </w:tcPr>
-          <w:p>
-            <w:pPr>
-              <w:jc w:val="center"/>
-            </w:pPr>
-            <w:r>
-              <w:t>☐</w:t>
-            </w:r>
-          </w:p>
-        </w:tc>
-      </w:tr>
-      <w:tr>
-        <w:tc>
-          <w:tcPr>
-            <w:tcW w:type="dxa" w:w="4896"/>
-          </w:tcPr>
-          <w:p>
-            <w:r>
-              <w:t>A versão do Django foi verificada.</w:t>
-            </w:r>
-          </w:p>
-        </w:tc>
-        <w:tc>
-          <w:tcPr>
-            <w:tcW w:type="dxa" w:w="4896"/>
-          </w:tcPr>
-          <w:p>
-            <w:pPr>
-              <w:jc w:val="center"/>
-            </w:pPr>
-            <w:r>
-              <w:t>☐</w:t>
-            </w:r>
-          </w:p>
-        </w:tc>
-      </w:tr>
-      <w:tr>
-        <w:tc>
-          <w:tcPr>
-            <w:tcW w:type="dxa" w:w="4896"/>
-          </w:tcPr>
-          <w:p>
-            <w:r>
-              <w:t>O projeto config foi criado.</w:t>
-            </w:r>
-          </w:p>
-        </w:tc>
-        <w:tc>
-          <w:tcPr>
-            <w:tcW w:type="dxa" w:w="4896"/>
-          </w:tcPr>
-          <w:p>
-            <w:pPr>
-              <w:jc w:val="center"/>
-            </w:pPr>
-            <w:r>
-              <w:t>☐</w:t>
-            </w:r>
-          </w:p>
-        </w:tc>
-      </w:tr>
-      <w:tr>
-        <w:tc>
-          <w:tcPr>
-            <w:tcW w:type="dxa" w:w="4896"/>
-          </w:tcPr>
-          <w:p>
-            <w:r>
-              <w:t>O comando migrate terminou com OK.</w:t>
-            </w:r>
-          </w:p>
-        </w:tc>
-        <w:tc>
-          <w:tcPr>
-            <w:tcW w:type="dxa" w:w="4896"/>
-          </w:tcPr>
-          <w:p>
-            <w:pPr>
-              <w:jc w:val="center"/>
-            </w:pPr>
-            <w:r>
-              <w:t>☐</w:t>
-            </w:r>
-          </w:p>
-        </w:tc>
-      </w:tr>
-      <w:tr>
-        <w:tc>
-          <w:tcPr>
-            <w:tcW w:type="dxa" w:w="4896"/>
-          </w:tcPr>
-          <w:p>
-            <w:r>
-              <w:t>O ficheiro db.sqlite3 foi criado.</w:t>
-            </w:r>
-          </w:p>
-        </w:tc>
-        <w:tc>
-          <w:tcPr>
-            <w:tcW w:type="dxa" w:w="4896"/>
-          </w:tcPr>
-          <w:p>
-            <w:pPr>
-              <w:jc w:val="center"/>
-            </w:pPr>
-            <w:r>
-              <w:t>☐</w:t>
-            </w:r>
-          </w:p>
-        </w:tc>
-      </w:tr>
-      <w:tr>
-        <w:tc>
-          <w:tcPr>
-            <w:tcW w:type="dxa" w:w="4896"/>
-          </w:tcPr>
-          <w:p>
-            <w:r>
-              <w:t>A página http://127.0.0.1:8000/ abriu no navegador.</w:t>
-            </w:r>
-          </w:p>
-        </w:tc>
-        <w:tc>
-          <w:tcPr>
-            <w:tcW w:type="dxa" w:w="4896"/>
-          </w:tcPr>
-          <w:p>
-            <w:pPr>
-              <w:jc w:val="center"/>
-            </w:pPr>
-            <w:r>
-              <w:t>☐</w:t>
-            </w:r>
-          </w:p>
-        </w:tc>
-      </w:tr>
-      <w:tr>
-        <w:tc>
-          <w:tcPr>
-            <w:tcW w:type="dxa" w:w="4896"/>
-          </w:tcPr>
-          <w:p>
-            <w:r>
-              <w:t>O servidor foi parado com CTRL + C.</w:t>
-            </w:r>
-          </w:p>
-        </w:tc>
-        <w:tc>
-          <w:tcPr>
-            <w:tcW w:type="dxa" w:w="4896"/>
-          </w:tcPr>
-          <w:p>
-            <w:pPr>
-              <w:jc w:val="center"/>
-            </w:pPr>
-            <w:r>
-              <w:t>☐</w:t>
-            </w:r>
-          </w:p>
-        </w:tc>
-      </w:tr>
-    </w:tbl>
-    <w:p>
-      <w:pPr>
-        <w:pStyle w:val="Heading1"/>
-      </w:pPr>
-      <w:r>
-        <w:t>Exercício prático</w:t>
-      </w:r>
-    </w:p>
-    <w:p>
-      <w:r>
-        <w:t>Executa todos os passos abaixo sem copiar apenas o resultado final:</w:t>
-      </w:r>
-    </w:p>
-    <w:p>
-      <w:pPr>
-        <w:pStyle w:val="CodeBlock"/>
-        <w:keepLines/>
-        <w:widowControl/>
-        <w:shd w:fill="F3F4F6"/>
-        <w:pBdr>
-          <w:bottom w:val="single" w:sz="4" w:space="1" w:color="CBD5E1"/>
-        </w:pBdr>
-      </w:pPr>
-      <w:r>
-        <w:rPr>
-          <w:rFonts w:ascii="Consolas" w:hAnsi="Consolas" w:eastAsia="Consolas"/>
-        </w:rPr>
-        <w:t>mkdir taskflow</w:t>
-        <w:br/>
-        <w:t>cd taskflow</w:t>
-        <w:br/>
-        <w:t>python -m venv .venv</w:t>
-        <w:br/>
-        <w:t>python -m pip install django</w:t>
-        <w:br/>
-        <w:t>django-admin startproject config .</w:t>
-        <w:br/>
-        <w:t>python manage.py migrate</w:t>
-        <w:br/>
-        <w:t>python manage.py runserver</w:t>
-      </w:r>
-    </w:p>
-    <w:p>
-      <w:r>
-        <w:t>Depois confirma:</w:t>
-      </w:r>
-    </w:p>
-    <w:p>
-      <w:pPr>
-        <w:pStyle w:val="ListNumber"/>
-        <w:spacing w:after="40"/>
-      </w:pPr>
-      <w:r>
-        <w:t>A página padrão do Django abriu no navegador.</w:t>
-      </w:r>
-    </w:p>
-    <w:p>
-      <w:pPr>
-        <w:pStyle w:val="ListNumber"/>
-        <w:spacing w:after="40"/>
-      </w:pPr>
-      <w:r>
-        <w:t>O ficheiro `db.sqlite3` foi criado.</w:t>
-      </w:r>
-    </w:p>
-    <w:p>
-      <w:pPr>
-        <w:pStyle w:val="ListNumber"/>
-        <w:spacing w:after="40"/>
-      </w:pPr>
-      <w:r>
-        <w:t>O comando `python -m django --version` mostra a versão instalada.</w:t>
-      </w:r>
-    </w:p>
-    <w:p>
-      <w:pPr>
-        <w:pStyle w:val="ListNumber"/>
-        <w:spacing w:after="40"/>
-      </w:pPr>
-      <w:r>
-        <w:t>A estrutura de pastas corresponde à apresentada nesta aula.</w:t>
-      </w:r>
-    </w:p>
-    <w:tbl>
-      <w:tblPr>
-        <w:tblW w:type="auto" w:w="0"/>
-        <w:jc w:val="center"/>
-        <w:tblLook w:firstColumn="1" w:firstRow="1" w:lastColumn="0" w:lastRow="0" w:noHBand="0" w:noVBand="1" w:val="04A0"/>
-      </w:tblPr>
-      <w:tblGrid>
-        <w:gridCol w:w="9792"/>
-      </w:tblGrid>
-      <w:tr>
-        <w:tc>
-          <w:tcPr>
-            <w:tcW w:type="dxa" w:w="9792"/>
-            <w:shd w:fill="E0F2FE"/>
-            <w:tcBorders>
-              <w:top w:val="single" w:sz="6" w:color="93C5FD"/>
-              <w:left w:val="single" w:sz="6" w:color="93C5FD"/>
-              <w:bottom w:val="single" w:sz="6" w:color="93C5FD"/>
-              <w:right w:val="single" w:sz="6" w:color="93C5FD"/>
-            </w:tcBorders>
-          </w:tcPr>
-          <w:p>
-            <w:pPr>
-              <w:spacing w:after="40"/>
-            </w:pPr>
-            <w:r>
-              <w:rPr>
-                <w:b/>
-                <w:color w:val="123B5D"/>
-              </w:rPr>
-              <w:t>Próxima aula</w:t>
-              <w:br/>
-            </w:r>
-            <w:r>
-              <w:t>Na Aula 2 vamos criar a app `tarefas` e construir a primeira página própria do TaskFlow, substituindo a página padrão do Django.</w:t>
-            </w:r>
-          </w:p>
-        </w:tc>
-      </w:tr>
-    </w:tbl>
-    <w:p>
-      <w:pPr>
-        <w:spacing w:after="0"/>
-      </w:pPr>
-    </w:p>
-    <w:p>
-      <w:pPr>
-        <w:pStyle w:val="Heading1"/>
-      </w:pPr>
-      <w:r>
-        <w:t>Resumo essencial</w:t>
-      </w:r>
-    </w:p>
-    <w:p>
-      <w:pPr>
-        <w:pStyle w:val="ListBullet"/>
-        <w:spacing w:after="40"/>
-      </w:pPr>
-      <w:r>
-        <w:t>Django recebe pedidos HTTP e devolve respostas.</w:t>
-      </w:r>
-    </w:p>
-    <w:p>
-      <w:pPr>
-        <w:pStyle w:val="ListBullet"/>
-        <w:spacing w:after="40"/>
-      </w:pPr>
-      <w:r>
-        <w:t>Um projeto contém a configuração geral; uma app contém uma funcionalidade.</w:t>
-      </w:r>
-    </w:p>
-    <w:p>
-      <w:pPr>
-        <w:pStyle w:val="ListBullet"/>
-        <w:spacing w:after="40"/>
-      </w:pPr>
-      <w:r>
-        <w:t>O ambiente virtual mantém as dependências isoladas.</w:t>
-      </w:r>
-    </w:p>
-    <w:p>
-      <w:pPr>
-        <w:pStyle w:val="ListBullet"/>
-        <w:spacing w:after="40"/>
-      </w:pPr>
-      <w:r>
-        <w:t>`manage.py` é o centro de operações do projeto.</w:t>
-      </w:r>
-    </w:p>
-    <w:p>
-      <w:pPr>
-        <w:pStyle w:val="ListBullet"/>
-        <w:spacing w:after="40"/>
-      </w:pPr>
-      <w:r>
-        <w:t>`migrate` cria e atualiza a estrutura da base de dados.</w:t>
-      </w:r>
-    </w:p>
-    <w:p>
-      <w:pPr>
-        <w:pStyle w:val="ListBullet"/>
-        <w:spacing w:after="40"/>
-      </w:pPr>
-      <w:r>
-        <w:t>`runserver` inicia o servidor de desenvolvimento local.</w:t>
-      </w:r>
-    </w:p>
-    <w:p>
-      <w:pPr>
-        <w:pStyle w:val="ListBullet"/>
-        <w:spacing w:after="40"/>
-      </w:pPr>
-      <w:r>
-        <w:t>O navegador comunica com o Django através de URLs e pedidos HTTP.</w:t>
-      </w:r>
-    </w:p>
-    <w:sectPr>
-      <w:footerReference w:type="default" r:id="rId9"/>
-      <w:headerReference w:type="default" r:id="rId11"/>
-      <w:pgSz w:w="12240" w:h="15840"/>
-      <w:pgMar w:top="1080" w:right="1224" w:bottom="1008" w:left="1224" w:header="720" w:footer="720" w:gutter="0"/>
-      <w:cols w:space="720"/>
-      <w:docGrid w:linePitch="360"/>
-    </w:sectPr>
-  </w:body>
-</w:document>
+<ns0:document xmlns:ns0="http://schemas.openxmlformats.org/wordprocessingml/2006/main" xmlns:ns1="http://schemas.openxmlformats.org/markup-compatibility/2006" xmlns:ns2="http://schemas.openxmlformats.org/drawingml/2006/wordprocessingDrawing" xmlns:ns3="http://schemas.openxmlformats.org/drawingml/2006/main" xmlns:ns4="http://schemas.openxmlformats.org/drawingml/2006/picture" xmlns:ns5="http://schemas.openxmlformats.org/officeDocument/2006/relationships" ns1:Ignorable="w14 wp14">
+  <ns0:body>
+    <ns0:p>
+      <ns0:pPr>
+        <ns0:spacing ns0:before="1400"/>
+        <ns0:jc ns0:val="center"/>
+      </ns0:pPr>
+      <ns0:r>
+        <ns0:rPr>
+          <ns0:b/>
+          <ns0:color ns0:val="1E669B"/>
+          <ns0:sz ns0:val="28"/>
+        </ns0:rPr>
+        <ns0:t>CURSO PRÁTICO DE DJANGO</ns0:t>
+      </ns0:r>
+    </ns0:p>
+    <ns0:p>
+      <ns0:pPr>
+        <ns0:jc ns0:val="center"/>
+      </ns0:pPr>
+      <ns0:r>
+        <ns0:rPr>
+          <ns0:b/>
+          <ns0:color ns0:val="123B5D"/>
+          <ns0:sz ns0:val="60"/>
+        </ns0:rPr>
+        <ns0:t>Aula 1</ns0:t>
+        <ns0:br/>
+        <ns0:t>Criar o primeiro projeto Django</ns0:t>
+      </ns0:r>
+    </ns0:p>
+    <ns0:p>
+      <ns0:pPr>
+        <ns0:jc ns0:val="center"/>
+      </ns0:pPr>
+      <ns0:r>
+        <ns0:rPr>
+          <ns0:i/>
+          <ns0:color ns0:val="475569"/>
+          <ns0:sz ns0:val="28"/>
+        </ns0:rPr>
+        <ns0:t>Do Python para aplicações web reais</ns0:t>
+      </ns0:r>
+    </ns0:p>
+    <ns0:p/>
+    <ns0:tbl>
+      <ns0:tblPr>
+        <ns0:tblW ns0:type="auto" ns0:w="0"/>
+        <ns0:jc ns0:val="center"/>
+        <ns0:tblLayout ns0:type="fixed"/>
+        <ns0:tblLook ns0:firstColumn="1" ns0:firstRow="1" ns0:lastColumn="0" ns0:lastRow="0" ns0:noHBand="0" ns0:noVBand="1" ns0:val="04A0"/>
+      </ns0:tblPr>
+      <ns0:tblGrid>
+        <ns0:gridCol ns0:w="4896"/>
+        <ns0:gridCol ns0:w="4896"/>
+      </ns0:tblGrid>
+      <ns0:tr>
+        <ns0:tc>
+          <ns0:tcPr>
+            <ns0:tcW ns0:type="dxa" ns0:w="2304"/>
+            <ns0:shd ns0:fill="E0F2FE"/>
+            <ns0:tcBorders>
+              <ns0:top ns0:val="single" ns0:sz="4" ns0:color="CBD5E1"/>
+              <ns0:left ns0:val="single" ns0:sz="4" ns0:color="CBD5E1"/>
+              <ns0:bottom ns0:val="single" ns0:sz="4" ns0:color="CBD5E1"/>
+              <ns0:right ns0:val="single" ns0:sz="4" ns0:color="CBD5E1"/>
+            </ns0:tcBorders>
+          </ns0:tcPr>
+          <ns0:p>
+            <ns0:r>
+              <ns0:rPr>
+                <ns0:b/>
+              </ns0:rPr>
+              <ns0:t>Projeto-guia</ns0:t>
+            </ns0:r>
+          </ns0:p>
+        </ns0:tc>
+        <ns0:tc>
+          <ns0:tcPr>
+            <ns0:tcW ns0:type="dxa" ns0:w="6912"/>
+            <ns0:tcBorders>
+              <ns0:top ns0:val="single" ns0:sz="4" ns0:color="CBD5E1"/>
+              <ns0:left ns0:val="single" ns0:sz="4" ns0:color="CBD5E1"/>
+              <ns0:bottom ns0:val="single" ns0:sz="4" ns0:color="CBD5E1"/>
+              <ns0:right ns0:val="single" ns0:sz="4" ns0:color="CBD5E1"/>
+            </ns0:tcBorders>
+          </ns0:tcPr>
+          <ns0:p>
+            <ns0:r>
+              <ns0:t>Catálogo Web — base do GestorWeb</ns0:t>
+            </ns0:r>
+          </ns0:p>
+        </ns0:tc>
+      </ns0:tr>
+      <ns0:tr>
+        <ns0:tc>
+          <ns0:tcPr>
+            <ns0:tcW ns0:type="dxa" ns0:w="2304"/>
+            <ns0:shd ns0:fill="E0F2FE"/>
+            <ns0:tcBorders>
+              <ns0:top ns0:val="single" ns0:sz="4" ns0:color="CBD5E1"/>
+              <ns0:left ns0:val="single" ns0:sz="4" ns0:color="CBD5E1"/>
+              <ns0:bottom ns0:val="single" ns0:sz="4" ns0:color="CBD5E1"/>
+              <ns0:right ns0:val="single" ns0:sz="4" ns0:color="CBD5E1"/>
+            </ns0:tcBorders>
+          </ns0:tcPr>
+          <ns0:p>
+            <ns0:r>
+              <ns0:rPr>
+                <ns0:b/>
+              </ns0:rPr>
+              <ns0:t>Objetivo</ns0:t>
+            </ns0:r>
+          </ns0:p>
+        </ns0:tc>
+        <ns0:tc>
+          <ns0:tcPr>
+            <ns0:tcW ns0:type="dxa" ns0:w="6912"/>
+            <ns0:tcBorders>
+              <ns0:top ns0:val="single" ns0:sz="4" ns0:color="CBD5E1"/>
+              <ns0:left ns0:val="single" ns0:sz="4" ns0:color="CBD5E1"/>
+              <ns0:bottom ns0:val="single" ns0:sz="4" ns0:color="CBD5E1"/>
+              <ns0:right ns0:val="single" ns0:sz="4" ns0:color="CBD5E1"/>
+            </ns0:tcBorders>
+          </ns0:tcPr>
+          <ns0:p>
+            <ns0:r>
+              <ns0:t>Compreender a estrutura inicial e executar o primeiro servidor</ns0:t>
+            </ns0:r>
+          </ns0:p>
+        </ns0:tc>
+      </ns0:tr>
+      <ns0:tr>
+        <ns0:tc>
+          <ns0:tcPr>
+            <ns0:tcW ns0:type="dxa" ns0:w="2304"/>
+            <ns0:shd ns0:fill="E0F2FE"/>
+            <ns0:tcBorders>
+              <ns0:top ns0:val="single" ns0:sz="4" ns0:color="CBD5E1"/>
+              <ns0:left ns0:val="single" ns0:sz="4" ns0:color="CBD5E1"/>
+              <ns0:bottom ns0:val="single" ns0:sz="4" ns0:color="CBD5E1"/>
+              <ns0:right ns0:val="single" ns0:sz="4" ns0:color="CBD5E1"/>
+            </ns0:tcBorders>
+          </ns0:tcPr>
+          <ns0:p>
+            <ns0:r>
+              <ns0:rPr>
+                <ns0:b/>
+              </ns0:rPr>
+              <ns0:t>Pré-requisito</ns0:t>
+            </ns0:r>
+          </ns0:p>
+        </ns0:tc>
+        <ns0:tc>
+          <ns0:tcPr>
+            <ns0:tcW ns0:type="dxa" ns0:w="6912"/>
+            <ns0:tcBorders>
+              <ns0:top ns0:val="single" ns0:sz="4" ns0:color="CBD5E1"/>
+              <ns0:left ns0:val="single" ns0:sz="4" ns0:color="CBD5E1"/>
+              <ns0:bottom ns0:val="single" ns0:sz="4" ns0:color="CBD5E1"/>
+              <ns0:right ns0:val="single" ns0:sz="4" ns0:color="CBD5E1"/>
+            </ns0:tcBorders>
+          </ns0:tcPr>
+          <ns0:p>
+            <ns0:r>
+              <ns0:t>Conhecimento básico de Python e uso do terminal</ns0:t>
+            </ns0:r>
+          </ns0:p>
+        </ns0:tc>
+      </ns0:tr>
+    </ns0:tbl>
+    <ns0:p/>
+    <ns0:p>
+      <ns0:pPr>
+        <ns0:jc ns0:val="center"/>
+      </ns0:pPr>
+      <ns0:r>
+        <ns0:rPr>
+          <ns0:color ns0:val="475569"/>
+          <ns0:sz ns0:val="20"/>
+        </ns0:rPr>
+        <ns0:t>Material de estudo</ns0:t>
+      </ns0:r>
+    </ns0:p>
+    <ns0:p>
+      <ns0:r>
+        <ns0:br ns0:type="page"/>
+      </ns0:r>
+    </ns0:p>
+    <ns0:p>
+      <ns0:pPr>
+        <ns0:pStyle ns0:val="Heading1"/>
+      </ns0:pPr>
+      <ns0:r>
+        <ns0:t>Como usar esta apostila</ns0:t>
+      </ns0:r>
+    </ns0:p>
+    <ns0:p>
+      <ns0:r>
+        <ns0:t>Esta aula foi pensada para ser executada no computador. Não basta ler os comandos: cria a pasta, executa cada passo, observa o resultado e só depois avança. O objetivo é compreender o Django, não decorar comandos.</ns0:t>
+      </ns0:r>
+    </ns0:p>
+    <ns0:tbl>
+      <ns0:tblPr>
+        <ns0:tblW ns0:type="auto" ns0:w="0"/>
+        <ns0:jc ns0:val="center"/>
+        <ns0:tblLook ns0:firstColumn="1" ns0:firstRow="1" ns0:lastColumn="0" ns0:lastRow="0" ns0:noHBand="0" ns0:noVBand="1" ns0:val="04A0"/>
+      </ns0:tblPr>
+      <ns0:tblGrid>
+        <ns0:gridCol ns0:w="9792"/>
+      </ns0:tblGrid>
+      <ns0:tr>
+        <ns0:tc>
+          <ns0:tcPr>
+            <ns0:tcW ns0:type="dxa" ns0:w="9792"/>
+            <ns0:shd ns0:fill="E0F2FE"/>
+            <ns0:tcBorders>
+              <ns0:top ns0:val="single" ns0:sz="6" ns0:color="93C5FD"/>
+              <ns0:left ns0:val="single" ns0:sz="6" ns0:color="93C5FD"/>
+              <ns0:bottom ns0:val="single" ns0:sz="6" ns0:color="93C5FD"/>
+              <ns0:right ns0:val="single" ns0:sz="6" ns0:color="93C5FD"/>
+            </ns0:tcBorders>
+          </ns0:tcPr>
+          <ns0:p>
+            <ns0:pPr>
+              <ns0:spacing ns0:after="40"/>
+            </ns0:pPr>
+            <ns0:r>
+              <ns0:rPr>
+                <ns0:b/>
+                <ns0:color ns0:val="123B5D"/>
+              </ns0:rPr>
+              <ns0:t>Método de aprendizagem</ns0:t>
+              <ns0:br/>
+            </ns0:r>
+            <ns0:r>
+              <ns0:t>Em cada etapa vamos seguir três movimentos: compreender o conceito, executar o código e verificar o resultado. Os erros também fazem parte do processo; aprenderemos a lê-los e corrigi-los.</ns0:t>
+            </ns0:r>
+          </ns0:p>
+        </ns0:tc>
+      </ns0:tr>
+    </ns0:tbl>
+    <ns0:p>
+      <ns0:pPr>
+        <ns0:spacing ns0:after="0"/>
+      </ns0:pPr>
+    </ns0:p>
+    <ns0:p>
+      <ns0:pPr>
+        <ns0:pStyle ns0:val="Heading1"/>
+      </ns0:pPr>
+      <ns0:r>
+        <ns0:t>O projeto que vamos construir</ns0:t>
+      </ns0:r>
+    </ns0:p>
+    <ns0:p>
+      <ns0:r>
+        <ns0:t>Durante o curso vamos criar o Catálogo Web, uma aplicação que evoluirá progressivamente até ao GestorWeb. Ela começará simples e crescerá a cada aula.</ns0:t>
+      </ns0:r>
+    </ns0:p>
+    <ns0:p>
+      <ns0:pPr>
+        <ns0:pStyle ns0:val="CodeBlock"/>
+        <ns0:keepLines/>
+        <ns0:widowControl/>
+        <ns0:shd ns0:fill="F3F4F6"/>
+        <ns0:pBdr>
+          <ns0:bottom ns0:val="single" ns0:sz="4" ns0:space="1" ns0:color="CBD5E1"/>
+        </ns0:pBdr>
+      </ns0:pPr>
+      <ns0:r>
+        <ns0:rPr>
+          <ns0:rFonts ns0:ascii="Consolas" ns0:hAnsi="Consolas" ns0:eastAsia="Consolas"/>
+        </ns0:rPr>
+        <ns0:t>Catálogo Web├── produtos├── categorias└── configuração geral</ns0:t>
+        <ns0:br/>
+        <ns0:t/>
+        <ns0:br/>
+        <ns0:t/>
+        <ns0:br/>
+        <ns0:t/>
+        <ns0:br/>
+        <ns0:t/>
+      </ns0:r>
+    </ns0:p>
+    <ns0:p>
+      <ns0:r>
+        <ns0:t>Uma distinção importante:</ns0:t>
+      </ns0:r>
+    </ns0:p>
+    <ns0:p>
+      <ns0:pPr>
+        <ns0:pStyle ns0:val="ListBullet"/>
+        <ns0:spacing ns0:after="40"/>
+      </ns0:pPr>
+      <ns0:r>
+        <ns0:t>Projeto Django: contém a configuração geral da aplicação.</ns0:t>
+      </ns0:r>
+    </ns0:p>
+    <ns0:p>
+      <ns0:pPr>
+        <ns0:pStyle ns0:val="ListBullet"/>
+        <ns0:spacing ns0:after="40"/>
+      </ns0:pPr>
+      <ns0:r>
+        <ns0:t>App Django: contém uma funcionalidade específica, como produtos, categorias ou contas.</ns0:t>
+      </ns0:r>
+    </ns0:p>
+    <ns0:p>
+      <ns0:pPr>
+        <ns0:pStyle ns0:val="Heading1"/>
+      </ns0:pPr>
+      <ns0:r>
+        <ns0:t>O que vamos aprender ao longo do curso</ns0:t>
+      </ns0:r>
+    </ns0:p>
+    <ns0:p>
+      <ns0:pPr>
+        <ns0:pStyle ns0:val="ListNumber"/>
+        <ns0:spacing ns0:after="40"/>
+      </ns0:pPr>
+      <ns0:r>
+        <ns0:t>Como a web funciona.</ns0:t>
+      </ns0:r>
+    </ns0:p>
+    <ns0:p>
+      <ns0:pPr>
+        <ns0:pStyle ns0:val="ListNumber"/>
+        <ns0:spacing ns0:after="40"/>
+      </ns0:pPr>
+      <ns0:r>
+        <ns0:t>Instalação e estrutura de um projeto Django.</ns0:t>
+      </ns0:r>
+    </ns0:p>
+    <ns0:p>
+      <ns0:pPr>
+        <ns0:pStyle ns0:val="ListNumber"/>
+        <ns0:spacing ns0:after="40"/>
+      </ns0:pPr>
+      <ns0:r>
+        <ns0:t>Apps, URLs, views e templates.</ns0:t>
+      </ns0:r>
+    </ns0:p>
+    <ns0:p>
+      <ns0:pPr>
+        <ns0:pStyle ns0:val="ListNumber"/>
+        <ns0:spacing ns0:after="40"/>
+      </ns0:pPr>
+      <ns0:r>
+        <ns0:t>Models, base de dados e migrations.</ns0:t>
+      </ns0:r>
+    </ns0:p>
+    <ns0:p>
+      <ns0:pPr>
+        <ns0:pStyle ns0:val="ListNumber"/>
+        <ns0:spacing ns0:after="40"/>
+      </ns0:pPr>
+      <ns0:r>
+        <ns0:t>Django Admin.</ns0:t>
+      </ns0:r>
+    </ns0:p>
+    <ns0:p>
+      <ns0:pPr>
+        <ns0:pStyle ns0:val="ListNumber"/>
+        <ns0:spacing ns0:after="40"/>
+      </ns0:pPr>
+      <ns0:r>
+        <ns0:t>Formulários e validação.</ns0:t>
+      </ns0:r>
+    </ns0:p>
+    <ns0:p>
+      <ns0:pPr>
+        <ns0:pStyle ns0:val="ListNumber"/>
+        <ns0:spacing ns0:after="40"/>
+      </ns0:pPr>
+      <ns0:r>
+        <ns0:t>Autenticação: registo, login e logout.</ns0:t>
+      </ns0:r>
+    </ns0:p>
+    <ns0:p>
+      <ns0:pPr>
+        <ns0:pStyle ns0:val="ListNumber"/>
+        <ns0:spacing ns0:after="40"/>
+      </ns0:pPr>
+      <ns0:r>
+        <ns0:t>Relações entre tabelas.</ns0:t>
+      </ns0:r>
+    </ns0:p>
+    <ns0:p>
+      <ns0:pPr>
+        <ns0:pStyle ns0:val="ListNumber"/>
+        <ns0:spacing ns0:after="40"/>
+      </ns0:pPr>
+      <ns0:r>
+        <ns0:t>Ficheiros estáticos, CSS e imagens.</ns0:t>
+      </ns0:r>
+    </ns0:p>
+    <ns0:p>
+      <ns0:pPr>
+        <ns0:pStyle ns0:val="ListNumber"/>
+        <ns0:spacing ns0:after="40"/>
+      </ns0:pPr>
+      <ns0:r>
+        <ns0:t>Organização profissional do código.</ns0:t>
+      </ns0:r>
+    </ns0:p>
+    <ns0:p>
+      <ns0:pPr>
+        <ns0:pStyle ns0:val="ListNumber"/>
+        <ns0:spacing ns0:after="40"/>
+      </ns0:pPr>
+      <ns0:r>
+        <ns0:t>Testes automáticos.</ns0:t>
+      </ns0:r>
+    </ns0:p>
+    <ns0:p>
+      <ns0:pPr>
+        <ns0:pStyle ns0:val="ListNumber"/>
+        <ns0:spacing ns0:after="40"/>
+      </ns0:pPr>
+      <ns0:r>
+        <ns0:t>Segurança no Django.</ns0:t>
+      </ns0:r>
+    </ns0:p>
+    <ns0:p>
+      <ns0:pPr>
+        <ns0:pStyle ns0:val="ListNumber"/>
+        <ns0:spacing ns0:after="40"/>
+      </ns0:pPr>
+      <ns0:r>
+        <ns0:t>Django REST Framework e APIs.</ns0:t>
+      </ns0:r>
+    </ns0:p>
+    <ns0:p>
+      <ns0:pPr>
+        <ns0:pStyle ns0:val="ListNumber"/>
+        <ns0:spacing ns0:after="40"/>
+      </ns0:pPr>
+      <ns0:r>
+        <ns0:t>JavaScript e HTMX.</ns0:t>
+      </ns0:r>
+    </ns0:p>
+    <ns0:p>
+      <ns0:pPr>
+        <ns0:pStyle ns0:val="ListNumber"/>
+        <ns0:spacing ns0:after="40"/>
+      </ns0:pPr>
+      <ns0:r>
+        <ns0:t>PostgreSQL, Docker e deployment.</ns0:t>
+      </ns0:r>
+    </ns0:p>
+    <ns0:p>
+      <ns0:pPr>
+        <ns0:pStyle ns0:val="ListNumber"/>
+        <ns0:spacing ns0:after="40"/>
+      </ns0:pPr>
+      <ns0:r>
+        <ns0:t>Performance, cache, tarefas assíncronas e arquitetura avançada.</ns0:t>
+      </ns0:r>
+    </ns0:p>
+    <ns0:p>
+      <ns0:pPr>
+        <ns0:pStyle ns0:val="Heading1"/>
+      </ns0:pPr>
+      <ns0:r>
+        <ns0:t>1. O que é Django?</ns0:t>
+      </ns0:r>
+    </ns0:p>
+    <ns0:p>
+      <ns0:r>
+        <ns0:t>Django é um framework web escrito em Python. Ele ajuda-nos a construir aplicações que recebem pedidos do navegador, processam informação e devolvem páginas ou dados.</ns0:t>
+      </ns0:r>
+    </ns0:p>
+    <ns0:p>
+      <ns0:pPr>
+        <ns0:jc ns0:val="center"/>
+      </ns0:pPr>
+      <ns0:r>
+        <ns0:drawing>
+          <ns2:inline>
+            <ns2:extent cx="5989320" cy="3443859"/>
+            <ns2:docPr id="1" name="Picture 1"/>
+            <ns2:cNvGraphicFramePr>
+              <ns3:graphicFrameLocks noChangeAspect="1"/>
+            </ns2:cNvGraphicFramePr>
+            <ns3:graphic>
+              <ns3:graphicData uri="http://schemas.openxmlformats.org/drawingml/2006/picture">
+                <ns4:pic>
+                  <ns4:nvPicPr>
+                    <ns4:cNvPr id="0" name="aula_1_fluxo_django.png"/>
+                    <ns4:cNvPicPr/>
+                  </ns4:nvPicPr>
+                  <ns4:blipFill>
+                    <ns3:blip ns5:embed="rId10"/>
+                    <ns3:stretch>
+                      <ns3:fillRect/>
+                    </ns3:stretch>
+                  </ns4:blipFill>
+                  <ns4:spPr>
+                    <ns3:xfrm>
+                      <ns3:off x="0" y="0"/>
+                      <ns3:ext cx="5989320" cy="3443859"/>
+                    </ns3:xfrm>
+                    <ns3:prstGeom prst="rect"/>
+                  </ns4:spPr>
+                </ns4:pic>
+              </ns3:graphicData>
+            </ns3:graphic>
+          </ns2:inline>
+        </ns0:drawing>
+      </ns0:r>
+    </ns0:p>
+    <ns0:p>
+      <ns0:pPr>
+        <ns0:jc ns0:val="center"/>
+      </ns0:pPr>
+      <ns0:r>
+        <ns0:rPr>
+          <ns0:i/>
+          <ns0:color ns0:val="475569"/>
+          <ns0:sz ns0:val="18"/>
+        </ns0:rPr>
+        <ns0:t>Figura 1 — Percurso simplificado de um pedido dentro de uma aplicação Django.</ns0:t>
+      </ns0:r>
+    </ns0:p>
+    <ns0:p>
+      <ns0:r>
+        <ns0:t>A sequência mental que deves guardar é: o navegador envia um pedido; o Django encontra a rota; uma view executa a lógica; a aplicação pode consultar a base de dados; um template gera HTML; e o navegador apresenta a resposta.</ns0:t>
+      </ns0:r>
+    </ns0:p>
+    <ns0:p>
+      <ns0:pPr>
+        <ns0:pStyle ns0:val="Heading1"/>
+      </ns0:pPr>
+      <ns0:r>
+        <ns0:t>2. Verificar o Python</ns0:t>
+      </ns0:r>
+    </ns0:p>
+    <ns0:p>
+      <ns0:r>
+        <ns0:t>Abre o terminal e verifica se o Python está instalado:</ns0:t>
+      </ns0:r>
+    </ns0:p>
+    <ns0:p>
+      <ns0:pPr>
+        <ns0:pStyle ns0:val="CodeBlock"/>
+        <ns0:keepLines/>
+        <ns0:widowControl/>
+        <ns0:shd ns0:fill="F3F4F6"/>
+        <ns0:pBdr>
+          <ns0:bottom ns0:val="single" ns0:sz="4" ns0:space="1" ns0:color="CBD5E1"/>
+        </ns0:pBdr>
+      </ns0:pPr>
+      <ns0:r>
+        <ns0:rPr>
+          <ns0:rFonts ns0:ascii="Consolas" ns0:hAnsi="Consolas" ns0:eastAsia="Consolas"/>
+        </ns0:rPr>
+        <ns0:t>python --version</ns0:t>
+      </ns0:r>
+    </ns0:p>
+    <ns0:p>
+      <ns0:r>
+        <ns0:t>Se esse comando não funcionar, tenta:</ns0:t>
+      </ns0:r>
+    </ns0:p>
+    <ns0:p>
+      <ns0:pPr>
+        <ns0:pStyle ns0:val="CodeBlock"/>
+        <ns0:keepLines/>
+        <ns0:widowControl/>
+        <ns0:shd ns0:fill="F3F4F6"/>
+        <ns0:pBdr>
+          <ns0:bottom ns0:val="single" ns0:sz="4" ns0:space="1" ns0:color="CBD5E1"/>
+        </ns0:pBdr>
+      </ns0:pPr>
+      <ns0:r>
+        <ns0:rPr>
+          <ns0:rFonts ns0:ascii="Consolas" ns0:hAnsi="Consolas" ns0:eastAsia="Consolas"/>
+        </ns0:rPr>
+        <ns0:t>python3 --version</ns0:t>
+      </ns0:r>
+    </ns0:p>
+    <ns0:tbl>
+      <ns0:tblPr>
+        <ns0:tblW ns0:type="auto" ns0:w="0"/>
+        <ns0:jc ns0:val="center"/>
+        <ns0:tblLook ns0:firstColumn="1" ns0:firstRow="1" ns0:lastColumn="0" ns0:lastRow="0" ns0:noHBand="0" ns0:noVBand="1" ns0:val="04A0"/>
+      </ns0:tblPr>
+      <ns0:tblGrid>
+        <ns0:gridCol ns0:w="9792"/>
+      </ns0:tblGrid>
+      <ns0:tr>
+        <ns0:tc>
+          <ns0:tcPr>
+            <ns0:tcW ns0:type="dxa" ns0:w="9792"/>
+            <ns0:shd ns0:fill="E0F2FE"/>
+            <ns0:tcBorders>
+              <ns0:top ns0:val="single" ns0:sz="6" ns0:color="93C5FD"/>
+              <ns0:left ns0:val="single" ns0:sz="6" ns0:color="93C5FD"/>
+              <ns0:bottom ns0:val="single" ns0:sz="6" ns0:color="93C5FD"/>
+              <ns0:right ns0:val="single" ns0:sz="6" ns0:color="93C5FD"/>
+            </ns0:tcBorders>
+          </ns0:tcPr>
+          <ns0:p>
+            <ns0:pPr>
+              <ns0:spacing ns0:after="40"/>
+            </ns0:pPr>
+            <ns0:r>
+              <ns0:rPr>
+                <ns0:b/>
+                <ns0:color ns0:val="123B5D"/>
+              </ns0:rPr>
+              <ns0:t>Atenção</ns0:t>
+              <ns0:br/>
+            </ns0:r>
+            <ns0:r>
+              <ns0:t>No Windows, o comando costuma ser python. Em Linux e macOS, pode ser necessário usar python3. Ao longo da aula, substitui python por python3 quando for esse o comando que funciona no teu computador.</ns0:t>
+            </ns0:r>
+          </ns0:p>
+        </ns0:tc>
+      </ns0:tr>
+    </ns0:tbl>
+    <ns0:p>
+      <ns0:pPr>
+        <ns0:spacing ns0:after="0"/>
+      </ns0:pPr>
+    </ns0:p>
+    <ns0:p>
+      <ns0:pPr>
+        <ns0:pStyle ns0:val="Heading1"/>
+      </ns0:pPr>
+      <ns0:r>
+        <ns0:t>3. Criar a pasta do projeto</ns0:t>
+      </ns0:r>
+    </ns0:p>
+    <ns0:p>
+      <ns0:r>
+        <ns0:t>Cria a pasta que vai conter o Catálogo Web e entra nela:</ns0:t>
+      </ns0:r>
+    </ns0:p>
+    <ns0:p>
+      <ns0:pPr>
+        <ns0:pStyle ns0:val="CodeBlock"/>
+        <ns0:keepLines/>
+        <ns0:widowControl/>
+        <ns0:shd ns0:fill="F3F4F6"/>
+        <ns0:pBdr>
+          <ns0:bottom ns0:val="single" ns0:sz="4" ns0:space="1" ns0:color="CBD5E1"/>
+        </ns0:pBdr>
+      </ns0:pPr>
+      <ns0:r>
+        <ns0:rPr>
+          <ns0:rFonts ns0:ascii="Consolas" ns0:hAnsi="Consolas" ns0:eastAsia="Consolas"/>
+        </ns0:rPr>
+        <ns0:t>mkdir taskflow</ns0:t>
+        <ns0:br/>
+        <ns0:t>cd taskflow</ns0:t>
+      </ns0:r>
+    </ns0:p>
+    <ns0:p>
+      <ns0:r>
+        <ns0:t>No Linux e macOS, podes confirmar a pasta atual com:</ns0:t>
+      </ns0:r>
+    </ns0:p>
+    <ns0:p>
+      <ns0:pPr>
+        <ns0:pStyle ns0:val="CodeBlock"/>
+        <ns0:keepLines/>
+        <ns0:widowControl/>
+        <ns0:shd ns0:fill="F3F4F6"/>
+        <ns0:pBdr>
+          <ns0:bottom ns0:val="single" ns0:sz="4" ns0:space="1" ns0:color="CBD5E1"/>
+        </ns0:pBdr>
+      </ns0:pPr>
+      <ns0:r>
+        <ns0:rPr>
+          <ns0:rFonts ns0:ascii="Consolas" ns0:hAnsi="Consolas" ns0:eastAsia="Consolas"/>
+        </ns0:rPr>
+        <ns0:t>pwd</ns0:t>
+      </ns0:r>
+    </ns0:p>
+    <ns0:p>
+      <ns0:r>
+        <ns0:t>No Windows PowerShell:</ns0:t>
+      </ns0:r>
+    </ns0:p>
+    <ns0:p>
+      <ns0:pPr>
+        <ns0:pStyle ns0:val="CodeBlock"/>
+        <ns0:keepLines/>
+        <ns0:widowControl/>
+        <ns0:shd ns0:fill="F3F4F6"/>
+        <ns0:pBdr>
+          <ns0:bottom ns0:val="single" ns0:sz="4" ns0:space="1" ns0:color="CBD5E1"/>
+        </ns0:pBdr>
+      </ns0:pPr>
+      <ns0:r>
+        <ns0:rPr>
+          <ns0:rFonts ns0:ascii="Consolas" ns0:hAnsi="Consolas" ns0:eastAsia="Consolas"/>
+        </ns0:rPr>
+        <ns0:t>Get-Location</ns0:t>
+      </ns0:r>
+    </ns0:p>
+    <ns0:p>
+      <ns0:pPr>
+        <ns0:pStyle ns0:val="Heading1"/>
+      </ns0:pPr>
+      <ns0:r>
+        <ns0:t>4. Criar um ambiente virtual</ns0:t>
+      </ns0:r>
+    </ns0:p>
+    <ns0:p>
+      <ns0:r>
+        <ns0:t>Um ambiente virtual isola as bibliotecas deste projeto. Assim, uma versão de Django usada pelo Catálogo Web não entra em conflito com as bibliotecas de outros projetos.</ns0:t>
+      </ns0:r>
+    </ns0:p>
+    <ns0:p>
+      <ns0:pPr>
+        <ns0:pStyle ns0:val="CodeBlock"/>
+        <ns0:keepLines/>
+        <ns0:widowControl/>
+        <ns0:shd ns0:fill="F3F4F6"/>
+        <ns0:pBdr>
+          <ns0:bottom ns0:val="single" ns0:sz="4" ns0:space="1" ns0:color="CBD5E1"/>
+        </ns0:pBdr>
+      </ns0:pPr>
+      <ns0:r>
+        <ns0:rPr>
+          <ns0:rFonts ns0:ascii="Consolas" ns0:hAnsi="Consolas" ns0:eastAsia="Consolas"/>
+        </ns0:rPr>
+        <ns0:t>python -m venv .venv</ns0:t>
+      </ns0:r>
+    </ns0:p>
+    <ns0:p>
+      <ns0:r>
+        <ns0:t>Ativa o ambiente virtual conforme o teu sistema:</ns0:t>
+      </ns0:r>
+    </ns0:p>
+    <ns0:p>
+      <ns0:pPr>
+        <ns0:pStyle ns0:val="CodeBlock"/>
+        <ns0:keepLines/>
+        <ns0:widowControl/>
+        <ns0:shd ns0:fill="F3F4F6"/>
+        <ns0:pBdr>
+          <ns0:bottom ns0:val="single" ns0:sz="4" ns0:space="1" ns0:color="CBD5E1"/>
+        </ns0:pBdr>
+      </ns0:pPr>
+      <ns0:r>
+        <ns0:rPr>
+          <ns0:rFonts ns0:ascii="Consolas" ns0:hAnsi="Consolas" ns0:eastAsia="Consolas"/>
+        </ns0:rPr>
+        <ns0:t># Linux ou macOS</ns0:t>
+        <ns0:br/>
+        <ns0:t>source .venv/bin/activate</ns0:t>
+        <ns0:br/>
+        <ns0:br/>
+        <ns0:t># Windows PowerShell</ns0:t>
+        <ns0:br/>
+        <ns0:t>.venv\Scripts\Activate.ps1</ns0:t>
+        <ns0:br/>
+        <ns0:br/>
+        <ns0:t># Windows CMD</ns0:t>
+        <ns0:br/>
+        <ns0:t>.venv\Scripts\activate.bat</ns0:t>
+      </ns0:r>
+    </ns0:p>
+    <ns0:p>
+      <ns0:r>
+        <ns0:t>Quando estiver ativo, normalmente verás `(.venv)` no início da linha do terminal:</ns0:t>
+      </ns0:r>
+    </ns0:p>
+    <ns0:p>
+      <ns0:pPr>
+        <ns0:pStyle ns0:val="CodeBlock"/>
+        <ns0:keepLines/>
+        <ns0:widowControl/>
+        <ns0:shd ns0:fill="F3F4F6"/>
+        <ns0:pBdr>
+          <ns0:bottom ns0:val="single" ns0:sz="4" ns0:space="1" ns0:color="CBD5E1"/>
+        </ns0:pBdr>
+      </ns0:pPr>
+      <ns0:r>
+        <ns0:rPr>
+          <ns0:rFonts ns0:ascii="Consolas" ns0:hAnsi="Consolas" ns0:eastAsia="Consolas"/>
+        </ns0:rPr>
+        <ns0:t>(.venv) user@computador:~/taskflow$</ns0:t>
+      </ns0:r>
+    </ns0:p>
+    <ns0:tbl>
+      <ns0:tblPr>
+        <ns0:tblW ns0:type="auto" ns0:w="0"/>
+        <ns0:jc ns0:val="center"/>
+        <ns0:tblLook ns0:firstColumn="1" ns0:firstRow="1" ns0:lastColumn="0" ns0:lastRow="0" ns0:noHBand="0" ns0:noVBand="1" ns0:val="04A0"/>
+      </ns0:tblPr>
+      <ns0:tblGrid>
+        <ns0:gridCol ns0:w="9792"/>
+      </ns0:tblGrid>
+      <ns0:tr>
+        <ns0:tc>
+          <ns0:tcPr>
+            <ns0:tcW ns0:type="dxa" ns0:w="9792"/>
+            <ns0:shd ns0:fill="E0F2FE"/>
+            <ns0:tcBorders>
+              <ns0:top ns0:val="single" ns0:sz="6" ns0:color="93C5FD"/>
+              <ns0:left ns0:val="single" ns0:sz="6" ns0:color="93C5FD"/>
+              <ns0:bottom ns0:val="single" ns0:sz="6" ns0:color="93C5FD"/>
+              <ns0:right ns0:val="single" ns0:sz="6" ns0:color="93C5FD"/>
+            </ns0:tcBorders>
+          </ns0:tcPr>
+          <ns0:p>
+            <ns0:pPr>
+              <ns0:spacing ns0:after="40"/>
+            </ns0:pPr>
+            <ns0:r>
+              <ns0:rPr>
+                <ns0:b/>
+                <ns0:color ns0:val="123B5D"/>
+              </ns0:rPr>
+              <ns0:t>Por que isto é importante?</ns0:t>
+              <ns0:br/>
+            </ns0:r>
+            <ns0:r>
+              <ns0:t>O prefixo (.venv) indica que os comandos de instalação serão aplicados ao ambiente deste projeto. É uma prática profissional e evita muitos problemas de dependências.</ns0:t>
+            </ns0:r>
+          </ns0:p>
+        </ns0:tc>
+      </ns0:tr>
+    </ns0:tbl>
+    <ns0:p>
+      <ns0:pPr>
+        <ns0:spacing ns0:after="0"/>
+      </ns0:pPr>
+    </ns0:p>
+    <ns0:p>
+      <ns0:pPr>
+        <ns0:pStyle ns0:val="Heading1"/>
+      </ns0:pPr>
+      <ns0:r>
+        <ns0:t>5. Instalar Django</ns0:t>
+      </ns0:r>
+    </ns0:p>
+    <ns0:p>
+      <ns0:r>
+        <ns0:t>Com o ambiente virtual ativo, instala o Django:</ns0:t>
+      </ns0:r>
+    </ns0:p>
+    <ns0:p>
+      <ns0:pPr>
+        <ns0:pStyle ns0:val="CodeBlock"/>
+        <ns0:keepLines/>
+        <ns0:widowControl/>
+        <ns0:shd ns0:fill="F3F4F6"/>
+        <ns0:pBdr>
+          <ns0:bottom ns0:val="single" ns0:sz="4" ns0:space="1" ns0:color="CBD5E1"/>
+        </ns0:pBdr>
+      </ns0:pPr>
+      <ns0:r>
+        <ns0:rPr>
+          <ns0:rFonts ns0:ascii="Consolas" ns0:hAnsi="Consolas" ns0:eastAsia="Consolas"/>
+        </ns0:rPr>
+        <ns0:t>python -m pip install django</ns0:t>
+      </ns0:r>
+    </ns0:p>
+    <ns0:p>
+      <ns0:r>
+        <ns0:t>Verifica a versão instalada:</ns0:t>
+      </ns0:r>
+    </ns0:p>
+    <ns0:p>
+      <ns0:pPr>
+        <ns0:pStyle ns0:val="CodeBlock"/>
+        <ns0:keepLines/>
+        <ns0:widowControl/>
+        <ns0:shd ns0:fill="F3F4F6"/>
+        <ns0:pBdr>
+          <ns0:bottom ns0:val="single" ns0:sz="4" ns0:space="1" ns0:color="CBD5E1"/>
+        </ns0:pBdr>
+      </ns0:pPr>
+      <ns0:r>
+        <ns0:rPr>
+          <ns0:rFonts ns0:ascii="Consolas" ns0:hAnsi="Consolas" ns0:eastAsia="Consolas"/>
+        </ns0:rPr>
+        <ns0:t>python -m django --version</ns0:t>
+      </ns0:r>
+    </ns0:p>
+    <ns0:p>
+      <ns0:r>
+        <ns0:t>Guarda as dependências do projeto num ficheiro:</ns0:t>
+      </ns0:r>
+    </ns0:p>
+    <ns0:p>
+      <ns0:pPr>
+        <ns0:pStyle ns0:val="CodeBlock"/>
+        <ns0:keepLines/>
+        <ns0:widowControl/>
+        <ns0:shd ns0:fill="F3F4F6"/>
+        <ns0:pBdr>
+          <ns0:bottom ns0:val="single" ns0:sz="4" ns0:space="1" ns0:color="CBD5E1"/>
+        </ns0:pBdr>
+      </ns0:pPr>
+      <ns0:r>
+        <ns0:rPr>
+          <ns0:rFonts ns0:ascii="Consolas" ns0:hAnsi="Consolas" ns0:eastAsia="Consolas"/>
+        </ns0:rPr>
+        <ns0:t>python -m pip freeze &gt; requirements.txt</ns0:t>
+      </ns0:r>
+    </ns0:p>
+    <ns0:p>
+      <ns0:r>
+        <ns0:t>O ficheiro `requirements.txt` permitirá instalar as mesmas bibliotecas noutro computador ou num servidor.</ns0:t>
+      </ns0:r>
+    </ns0:p>
+    <ns0:p>
+      <ns0:pPr>
+        <ns0:pStyle ns0:val="Heading1"/>
+      </ns0:pPr>
+      <ns0:r>
+        <ns0:t>6. Criar o projeto Django</ns0:t>
+      </ns0:r>
+    </ns0:p>
+    <ns0:p>
+      <ns0:r>
+        <ns0:t>Executa o comando seguinte dentro da pasta `taskflow`:</ns0:t>
+      </ns0:r>
+    </ns0:p>
+    <ns0:p>
+      <ns0:pPr>
+        <ns0:pStyle ns0:val="CodeBlock"/>
+        <ns0:keepLines/>
+        <ns0:widowControl/>
+        <ns0:shd ns0:fill="F3F4F6"/>
+        <ns0:pBdr>
+          <ns0:bottom ns0:val="single" ns0:sz="4" ns0:space="1" ns0:color="CBD5E1"/>
+        </ns0:pBdr>
+      </ns0:pPr>
+      <ns0:r>
+        <ns0:rPr>
+          <ns0:rFonts ns0:ascii="Consolas" ns0:hAnsi="Consolas" ns0:eastAsia="Consolas"/>
+        </ns0:rPr>
+        <ns0:t>django-admin startproject config .</ns0:t>
+      </ns0:r>
+    </ns0:p>
+    <ns0:p>
+      <ns0:r>
+        <ns0:t>O ponto final `.` é importante: ele diz ao Django para criar o projeto na pasta atual, evitando uma pasta duplicada.</ns0:t>
+      </ns0:r>
+    </ns0:p>
+    <ns0:p>
+      <ns0:r>
+        <ns0:t>A estrutura inicial ficará assim:</ns0:t>
+      </ns0:r>
+    </ns0:p>
+    <ns0:p>
+      <ns0:pPr>
+        <ns0:pStyle ns0:val="CodeBlock"/>
+        <ns0:keepLines/>
+        <ns0:widowControl/>
+        <ns0:shd ns0:fill="F3F4F6"/>
+        <ns0:pBdr>
+          <ns0:bottom ns0:val="single" ns0:sz="4" ns0:space="1" ns0:color="CBD5E1"/>
+        </ns0:pBdr>
+      </ns0:pPr>
+      <ns0:r>
+        <ns0:rPr>
+          <ns0:rFonts ns0:ascii="Consolas" ns0:hAnsi="Consolas" ns0:eastAsia="Consolas"/>
+        </ns0:rPr>
+        <ns0:t>taskflow/</ns0:t>
+        <ns0:br/>
+        <ns0:t>├── .venv/</ns0:t>
+        <ns0:br/>
+        <ns0:t>├── manage.py</ns0:t>
+        <ns0:br/>
+        <ns0:t>├── requirements.txt</ns0:t>
+        <ns0:br/>
+        <ns0:t>└── config/</ns0:t>
+        <ns0:br/>
+        <ns0:t xml:space="preserve">    ├── __init__.py</ns0:t>
+        <ns0:br/>
+        <ns0:t xml:space="preserve">    ├── settings.py</ns0:t>
+        <ns0:br/>
+        <ns0:t xml:space="preserve">    ├── urls.py</ns0:t>
+        <ns0:br/>
+        <ns0:t xml:space="preserve">    ├── asgi.py</ns0:t>
+        <ns0:br/>
+        <ns0:t xml:space="preserve">    └── wsgi.py</ns0:t>
+      </ns0:r>
+    </ns0:p>
+    <ns0:p>
+      <ns0:pPr>
+        <ns0:pStyle ns0:val="Heading2"/>
+      </ns0:pPr>
+      <ns0:r>
+        <ns0:t>Para que serve cada ficheiro?</ns0:t>
+      </ns0:r>
+    </ns0:p>
+    <ns0:p>
+      <ns0:pPr>
+        <ns0:pStyle ns0:val="ListBullet"/>
+        <ns0:spacing ns0:after="40"/>
+      </ns0:pPr>
+      <ns0:r>
+        <ns0:t>`manage.py`: principal comando administrativo do projeto. Será usado para iniciar o servidor, criar apps, executar migrations, criar utilizadores e correr testes.</ns0:t>
+      </ns0:r>
+    </ns0:p>
+    <ns0:p>
+      <ns0:pPr>
+        <ns0:pStyle ns0:val="ListBullet"/>
+        <ns0:spacing ns0:after="40"/>
+      </ns0:pPr>
+      <ns0:r>
+        <ns0:t>`config/settings.py`: configurações gerais, como apps instaladas, base de dados, idioma, fuso horário, ficheiros estáticos e segurança.</ns0:t>
+      </ns0:r>
+    </ns0:p>
+    <ns0:p>
+      <ns0:pPr>
+        <ns0:pStyle ns0:val="ListBullet"/>
+        <ns0:spacing ns0:after="40"/>
+      </ns0:pPr>
+      <ns0:r>
+        <ns0:t>`config/urls.py`: mapa principal das URLs da aplicação.</ns0:t>
+      </ns0:r>
+    </ns0:p>
+    <ns0:p>
+      <ns0:pPr>
+        <ns0:pStyle ns0:val="ListBullet"/>
+        <ns0:spacing ns0:after="40"/>
+      </ns0:pPr>
+      <ns0:r>
+        <ns0:t>`config/asgi.py`: ponto de entrada para servidores modernos que suportam comunicação assíncrona.</ns0:t>
+      </ns0:r>
+    </ns0:p>
+    <ns0:p>
+      <ns0:pPr>
+        <ns0:pStyle ns0:val="ListBullet"/>
+        <ns0:spacing ns0:after="40"/>
+      </ns0:pPr>
+      <ns0:r>
+        <ns0:t>`config/wsgi.py`: ponto de entrada para servidores web tradicionais compatíveis com WSGI.</ns0:t>
+      </ns0:r>
+    </ns0:p>
+    <ns0:p>
+      <ns0:pPr>
+        <ns0:pStyle ns0:val="ListBullet"/>
+        <ns0:spacing ns0:after="40"/>
+      </ns0:pPr>
+      <ns0:r>
+        <ns0:t>`__init__.py`: indica ao Python que a pasta pode ser tratada como um pacote.</ns0:t>
+      </ns0:r>
+    </ns0:p>
+    <ns0:p>
+      <ns0:pPr>
+        <ns0:pStyle ns0:val="Heading1"/>
+      </ns0:pPr>
+      <ns0:r>
+        <ns0:t>7. Criar a base de dados inicial</ns0:t>
+      </ns0:r>
+    </ns0:p>
+    <ns0:p>
+      <ns0:r>
+        <ns0:t>O Django já vem preparado para usar SQLite durante o desenvolvimento. Executa:</ns0:t>
+      </ns0:r>
+    </ns0:p>
+    <ns0:p>
+      <ns0:pPr>
+        <ns0:pStyle ns0:val="CodeBlock"/>
+        <ns0:keepLines/>
+        <ns0:widowControl/>
+        <ns0:shd ns0:fill="F3F4F6"/>
+        <ns0:pBdr>
+          <ns0:bottom ns0:val="single" ns0:sz="4" ns0:space="1" ns0:color="CBD5E1"/>
+        </ns0:pBdr>
+      </ns0:pPr>
+      <ns0:r>
+        <ns0:rPr>
+          <ns0:rFonts ns0:ascii="Consolas" ns0:hAnsi="Consolas" ns0:eastAsia="Consolas"/>
+        </ns0:rPr>
+        <ns0:t>python manage.py migrate</ns0:t>
+      </ns0:r>
+    </ns0:p>
+    <ns0:p>
+      <ns0:r>
+        <ns0:t>Deverás ver várias linhas semelhantes a estas:</ns0:t>
+      </ns0:r>
+    </ns0:p>
+    <ns0:p>
+      <ns0:pPr>
+        <ns0:pStyle ns0:val="CodeBlock"/>
+        <ns0:keepLines/>
+        <ns0:widowControl/>
+        <ns0:shd ns0:fill="F3F4F6"/>
+        <ns0:pBdr>
+          <ns0:bottom ns0:val="single" ns0:sz="4" ns0:space="1" ns0:color="CBD5E1"/>
+        </ns0:pBdr>
+      </ns0:pPr>
+      <ns0:r>
+        <ns0:rPr>
+          <ns0:rFonts ns0:ascii="Consolas" ns0:hAnsi="Consolas" ns0:eastAsia="Consolas"/>
+        </ns0:rPr>
+        <ns0:t>Applying contenttypes.0001_initial... OK</ns0:t>
+        <ns0:br/>
+        <ns0:t>Applying auth.0001_initial... OK</ns0:t>
+        <ns0:br/>
+        <ns0:t>Applying admin.0001_initial... OK</ns0:t>
+        <ns0:br/>
+        <ns0:t>Applying sessions.0001_initial... OK</ns0:t>
+      </ns0:r>
+    </ns0:p>
+    <ns0:p>
+      <ns0:r>
+        <ns0:t>Agora aparecerá o ficheiro `db.sqlite3`:</ns0:t>
+      </ns0:r>
+    </ns0:p>
+    <ns0:p>
+      <ns0:pPr>
+        <ns0:pStyle ns0:val="CodeBlock"/>
+        <ns0:keepLines/>
+        <ns0:widowControl/>
+        <ns0:shd ns0:fill="F3F4F6"/>
+        <ns0:pBdr>
+          <ns0:bottom ns0:val="single" ns0:sz="4" ns0:space="1" ns0:color="CBD5E1"/>
+        </ns0:pBdr>
+      </ns0:pPr>
+      <ns0:r>
+        <ns0:rPr>
+          <ns0:rFonts ns0:ascii="Consolas" ns0:hAnsi="Consolas" ns0:eastAsia="Consolas"/>
+        </ns0:rPr>
+        <ns0:t>taskflow/</ns0:t>
+        <ns0:br/>
+        <ns0:t>├── .venv/</ns0:t>
+        <ns0:br/>
+        <ns0:t>├── config/</ns0:t>
+        <ns0:br/>
+        <ns0:t>├── db.sqlite3</ns0:t>
+        <ns0:br/>
+        <ns0:t>├── manage.py</ns0:t>
+        <ns0:br/>
+        <ns0:t>└── requirements.txt</ns0:t>
+      </ns0:r>
+    </ns0:p>
+    <ns0:p>
+      <ns0:r>
+        <ns0:t>O Django criou tabelas internas para utilizadores, grupos, permissões, sessões e o painel administrativo. Ainda não criámos as tabelas de produtos e categorias; isso acontecerá quando criarmos os primeiros models.</ns0:t>
+      </ns0:r>
+    </ns0:p>
+    <ns0:p>
+      <ns0:pPr>
+        <ns0:pStyle ns0:val="Heading1"/>
+      </ns0:pPr>
+      <ns0:r>
+        <ns0:t>8. Iniciar o servidor</ns0:t>
+      </ns0:r>
+    </ns0:p>
+    <ns0:p>
+      <ns0:r>
+        <ns0:t>Executa:</ns0:t>
+      </ns0:r>
+    </ns0:p>
+    <ns0:p>
+      <ns0:pPr>
+        <ns0:pStyle ns0:val="CodeBlock"/>
+        <ns0:keepLines/>
+        <ns0:widowControl/>
+        <ns0:shd ns0:fill="F3F4F6"/>
+        <ns0:pBdr>
+          <ns0:bottom ns0:val="single" ns0:sz="4" ns0:space="1" ns0:color="CBD5E1"/>
+        </ns0:pBdr>
+      </ns0:pPr>
+      <ns0:r>
+        <ns0:rPr>
+          <ns0:rFonts ns0:ascii="Consolas" ns0:hAnsi="Consolas" ns0:eastAsia="Consolas"/>
+        </ns0:rPr>
+        <ns0:t>python manage.py runserver</ns0:t>
+      </ns0:r>
+    </ns0:p>
+    <ns0:p>
+      <ns0:r>
+        <ns0:t>O terminal deverá mostrar algo semelhante a:</ns0:t>
+      </ns0:r>
+    </ns0:p>
+    <ns0:p>
+      <ns0:pPr>
+        <ns0:pStyle ns0:val="CodeBlock"/>
+        <ns0:keepLines/>
+        <ns0:widowControl/>
+        <ns0:shd ns0:fill="F3F4F6"/>
+        <ns0:pBdr>
+          <ns0:bottom ns0:val="single" ns0:sz="4" ns0:space="1" ns0:color="CBD5E1"/>
+        </ns0:pBdr>
+      </ns0:pPr>
+      <ns0:r>
+        <ns0:rPr>
+          <ns0:rFonts ns0:ascii="Consolas" ns0:hAnsi="Consolas" ns0:eastAsia="Consolas"/>
+        </ns0:rPr>
+        <ns0:t>Starting development server at http://127.0.0.1:8000/</ns0:t>
+        <ns0:br/>
+        <ns0:t>Quit the server with CONTROL-C.</ns0:t>
+      </ns0:r>
+    </ns0:p>
+    <ns0:p>
+      <ns0:r>
+        <ns0:t>Abre no navegador:</ns0:t>
+      </ns0:r>
+    </ns0:p>
+    <ns0:p>
+      <ns0:pPr>
+        <ns0:pStyle ns0:val="CodeBlock"/>
+        <ns0:keepLines/>
+        <ns0:widowControl/>
+        <ns0:shd ns0:fill="F3F4F6"/>
+        <ns0:pBdr>
+          <ns0:bottom ns0:val="single" ns0:sz="4" ns0:space="1" ns0:color="CBD5E1"/>
+        </ns0:pBdr>
+      </ns0:pPr>
+      <ns0:r>
+        <ns0:rPr>
+          <ns0:rFonts ns0:ascii="Consolas" ns0:hAnsi="Consolas" ns0:eastAsia="Consolas"/>
+        </ns0:rPr>
+        <ns0:t>http://127.0.0.1:8000/</ns0:t>
+      </ns0:r>
+    </ns0:p>
+    <ns0:p>
+      <ns0:r>
+        <ns0:t>Deverás ver a página inicial do Django com uma mensagem semelhante a “The install worked successfully!”. Isso confirma que o Python, o Django, o projeto, as configurações e o servidor estão a funcionar.</ns0:t>
+      </ns0:r>
+    </ns0:p>
+    <ns0:p>
+      <ns0:r>
+        <ns0:t>Para parar o servidor, usa:</ns0:t>
+      </ns0:r>
+    </ns0:p>
+    <ns0:p>
+      <ns0:pPr>
+        <ns0:pStyle ns0:val="CodeBlock"/>
+        <ns0:keepLines/>
+        <ns0:widowControl/>
+        <ns0:shd ns0:fill="F3F4F6"/>
+        <ns0:pBdr>
+          <ns0:bottom ns0:val="single" ns0:sz="4" ns0:space="1" ns0:color="CBD5E1"/>
+        </ns0:pBdr>
+      </ns0:pPr>
+      <ns0:r>
+        <ns0:rPr>
+          <ns0:rFonts ns0:ascii="Consolas" ns0:hAnsi="Consolas" ns0:eastAsia="Consolas"/>
+        </ns0:rPr>
+        <ns0:t>CTRL + C</ns0:t>
+      </ns0:r>
+    </ns0:p>
+    <ns0:p>
+      <ns0:pPr>
+        <ns0:pStyle ns0:val="Heading1"/>
+      </ns0:pPr>
+      <ns0:r>
+        <ns0:t>O que aconteceu por trás dos bastidores?</ns0:t>
+      </ns0:r>
+    </ns0:p>
+    <ns0:p>
+      <ns0:r>
+        <ns0:t>Quando abriste `http://127.0.0.1:8000/`, o navegador enviou um pedido HTTP semelhante a:</ns0:t>
+      </ns0:r>
+    </ns0:p>
+    <ns0:p>
+      <ns0:pPr>
+        <ns0:pStyle ns0:val="CodeBlock"/>
+        <ns0:keepLines/>
+        <ns0:widowControl/>
+        <ns0:shd ns0:fill="F3F4F6"/>
+        <ns0:pBdr>
+          <ns0:bottom ns0:val="single" ns0:sz="4" ns0:space="1" ns0:color="CBD5E1"/>
+        </ns0:pBdr>
+      </ns0:pPr>
+      <ns0:r>
+        <ns0:rPr>
+          <ns0:rFonts ns0:ascii="Consolas" ns0:hAnsi="Consolas" ns0:eastAsia="Consolas"/>
+        </ns0:rPr>
+        <ns0:t>GET /</ns0:t>
+      </ns0:r>
+    </ns0:p>
+    <ns0:p>
+      <ns0:r>
+        <ns0:t>O Django recebeu o pedido e consultou `config/urls.py`. Como ainda não definimos uma página inicial própria, mostrou a página padrão de instalação.</ns0:t>
+      </ns0:r>
+    </ns0:p>
+    <ns0:p>
+      <ns0:pPr>
+        <ns0:pStyle ns0:val="CodeBlock"/>
+        <ns0:keepLines/>
+        <ns0:widowControl/>
+        <ns0:shd ns0:fill="F3F4F6"/>
+        <ns0:pBdr>
+          <ns0:bottom ns0:val="single" ns0:sz="4" ns0:space="1" ns0:color="CBD5E1"/>
+        </ns0:pBdr>
+      </ns0:pPr>
+      <ns0:r>
+        <ns0:t>GET /  →  URL definida em urls.py</ns0:t>
+        <ns0:br/>
+        <ns0:t xml:space="preserve">      →  View em Python</ns0:t>
+        <ns0:br/>
+        <ns0:t xml:space="preserve">      →  Consulta aos produtos, quando necessário</ns0:t>
+        <ns0:br/>
+        <ns0:t xml:space="preserve">      →  Template HTML</ns0:t>
+        <ns0:br/>
+        <ns0:t xml:space="preserve">      →  Página apresentada no navegador</ns0:t>
+      </ns0:r>
+    </ns0:p>
+    <ns0:p>
+      <ns0:pPr>
+        <ns0:pStyle ns0:val="Heading1"/>
+      </ns0:pPr>
+      <ns0:r>
+        <ns0:t>Primeira regra profissional: usa o ambiente virtual</ns0:t>
+      </ns0:r>
+    </ns0:p>
+    <ns0:p>
+      <ns0:r>
+        <ns0:t>Antes de executar comandos Django ou instalar bibliotecas, confirma que o ambiente virtual está ativo. Caso contrário, podes instalar pacotes no local errado e acabar com versões incompatíveis.</ns0:t>
+      </ns0:r>
+    </ns0:p>
+    <ns0:p>
+      <ns0:r>
+        <ns0:t>Também não devemos colocar a pasta `.venv` ou a base de dados local no Git. Cria um ficheiro chamado `.gitignore` na pasta principal:</ns0:t>
+      </ns0:r>
+    </ns0:p>
+    <ns0:p>
+      <ns0:pPr>
+        <ns0:pStyle ns0:val="CodeBlock"/>
+        <ns0:keepLines/>
+        <ns0:widowControl/>
+        <ns0:shd ns0:fill="F3F4F6"/>
+        <ns0:pBdr>
+          <ns0:bottom ns0:val="single" ns0:sz="4" ns0:space="1" ns0:color="CBD5E1"/>
+        </ns0:pBdr>
+      </ns0:pPr>
+      <ns0:r>
+        <ns0:rPr>
+          <ns0:rFonts ns0:ascii="Consolas" ns0:hAnsi="Consolas" ns0:eastAsia="Consolas"/>
+        </ns0:rPr>
+        <ns0:t>.venv/</ns0:t>
+        <ns0:br/>
+        <ns0:t>__pycache__/</ns0:t>
+        <ns0:br/>
+        <ns0:t>*.pyc</ns0:t>
+        <ns0:br/>
+        <ns0:t>db.sqlite3</ns0:t>
+        <ns0:br/>
+        <ns0:t>.env</ns0:t>
+      </ns0:r>
+    </ns0:p>
+    <ns0:p>
+      <ns0:r>
+        <ns0:t>Mais tarde, quando publicarmos a aplicação, vamos usar PostgreSQL e variáveis de ambiente para os dados sensíveis.</ns0:t>
+      </ns0:r>
+    </ns0:p>
+    <ns0:p>
+      <ns0:pPr>
+        <ns0:pStyle ns0:val="Heading1"/>
+      </ns0:pPr>
+      <ns0:r>
+        <ns0:t>Checklist da Aula 1</ns0:t>
+      </ns0:r>
+    </ns0:p>
+    <ns0:tbl>
+      <ns0:tblPr>
+        <ns0:tblStyle ns0:val="TableGrid"/>
+        <ns0:tblW ns0:type="auto" ns0:w="0"/>
+        <ns0:jc ns0:val="center"/>
+        <ns0:tblLook ns0:firstColumn="1" ns0:firstRow="1" ns0:lastColumn="0" ns0:lastRow="0" ns0:noHBand="0" ns0:noVBand="1" ns0:val="04A0"/>
+      </ns0:tblPr>
+      <ns0:tblGrid>
+        <ns0:gridCol ns0:w="4896"/>
+        <ns0:gridCol ns0:w="4896"/>
+      </ns0:tblGrid>
+      <ns0:tr>
+        <ns0:tc>
+          <ns0:tcPr>
+            <ns0:tcW ns0:type="dxa" ns0:w="4896"/>
+            <ns0:shd ns0:fill="123B5D"/>
+          </ns0:tcPr>
+          <ns0:p>
+            <ns0:r>
+              <ns0:rPr>
+                <ns0:b/>
+                <ns0:color ns0:val="FFFFFF"/>
+              </ns0:rPr>
+              <ns0:t>Verificação</ns0:t>
+            </ns0:r>
+          </ns0:p>
+        </ns0:tc>
+        <ns0:tc>
+          <ns0:tcPr>
+            <ns0:tcW ns0:type="dxa" ns0:w="4896"/>
+            <ns0:shd ns0:fill="123B5D"/>
+          </ns0:tcPr>
+          <ns0:p>
+            <ns0:r>
+              <ns0:rPr>
+                <ns0:b/>
+                <ns0:color ns0:val="FFFFFF"/>
+              </ns0:rPr>
+              <ns0:t>Concluído</ns0:t>
+            </ns0:r>
+          </ns0:p>
+        </ns0:tc>
+      </ns0:tr>
+      <ns0:tr>
+        <ns0:tc>
+          <ns0:tcPr>
+            <ns0:tcW ns0:type="dxa" ns0:w="4896"/>
+          </ns0:tcPr>
+          <ns0:p>
+            <ns0:r>
+              <ns0:t>O comando python --version funciona.</ns0:t>
+            </ns0:r>
+          </ns0:p>
+        </ns0:tc>
+        <ns0:tc>
+          <ns0:tcPr>
+            <ns0:tcW ns0:type="dxa" ns0:w="4896"/>
+          </ns0:tcPr>
+          <ns0:p>
+            <ns0:pPr>
+              <ns0:jc ns0:val="center"/>
+            </ns0:pPr>
+            <ns0:r>
+              <ns0:t>☐</ns0:t>
+            </ns0:r>
+          </ns0:p>
+        </ns0:tc>
+      </ns0:tr>
+      <ns0:tr>
+        <ns0:tc>
+          <ns0:tcPr>
+            <ns0:tcW ns0:type="dxa" ns0:w="4896"/>
+          </ns0:tcPr>
+          <ns0:p>
+            <ns0:r>
+              <ns0:t>O ambiente virtual foi criado e ativado.</ns0:t>
+            </ns0:r>
+          </ns0:p>
+        </ns0:tc>
+        <ns0:tc>
+          <ns0:tcPr>
+            <ns0:tcW ns0:type="dxa" ns0:w="4896"/>
+          </ns0:tcPr>
+          <ns0:p>
+            <ns0:pPr>
+              <ns0:jc ns0:val="center"/>
+            </ns0:pPr>
+            <ns0:r>
+              <ns0:t>☐</ns0:t>
+            </ns0:r>
+          </ns0:p>
+        </ns0:tc>
+      </ns0:tr>
+      <ns0:tr>
+        <ns0:tc>
+          <ns0:tcPr>
+            <ns0:tcW ns0:type="dxa" ns0:w="4896"/>
+          </ns0:tcPr>
+          <ns0:p>
+            <ns0:r>
+              <ns0:t>O Django foi instalado.</ns0:t>
+            </ns0:r>
+          </ns0:p>
+        </ns0:tc>
+        <ns0:tc>
+          <ns0:tcPr>
+            <ns0:tcW ns0:type="dxa" ns0:w="4896"/>
+          </ns0:tcPr>
+          <ns0:p>
+            <ns0:pPr>
+              <ns0:jc ns0:val="center"/>
+            </ns0:pPr>
+            <ns0:r>
+              <ns0:t>☐</ns0:t>
+            </ns0:r>
+          </ns0:p>
+        </ns0:tc>
+      </ns0:tr>
+      <ns0:tr>
+        <ns0:tc>
+          <ns0:tcPr>
+            <ns0:tcW ns0:type="dxa" ns0:w="4896"/>
+          </ns0:tcPr>
+          <ns0:p>
+            <ns0:r>
+              <ns0:t>A versão do Django foi verificada.</ns0:t>
+            </ns0:r>
+          </ns0:p>
+        </ns0:tc>
+        <ns0:tc>
+          <ns0:tcPr>
+            <ns0:tcW ns0:type="dxa" ns0:w="4896"/>
+          </ns0:tcPr>
+          <ns0:p>
+            <ns0:pPr>
+              <ns0:jc ns0:val="center"/>
+            </ns0:pPr>
+            <ns0:r>
+              <ns0:t>☐</ns0:t>
+            </ns0:r>
+          </ns0:p>
+        </ns0:tc>
+      </ns0:tr>
+      <ns0:tr>
+        <ns0:tc>
+          <ns0:tcPr>
+            <ns0:tcW ns0:type="dxa" ns0:w="4896"/>
+          </ns0:tcPr>
+          <ns0:p>
+            <ns0:r>
+              <ns0:t>O projeto config foi criado.</ns0:t>
+            </ns0:r>
+          </ns0:p>
+        </ns0:tc>
+        <ns0:tc>
+          <ns0:tcPr>
+            <ns0:tcW ns0:type="dxa" ns0:w="4896"/>
+          </ns0:tcPr>
+          <ns0:p>
+            <ns0:pPr>
+              <ns0:jc ns0:val="center"/>
+            </ns0:pPr>
+            <ns0:r>
+              <ns0:t>☐</ns0:t>
+            </ns0:r>
+          </ns0:p>
+        </ns0:tc>
+      </ns0:tr>
+      <ns0:tr>
+        <ns0:tc>
+          <ns0:tcPr>
+            <ns0:tcW ns0:type="dxa" ns0:w="4896"/>
+          </ns0:tcPr>
+          <ns0:p>
+            <ns0:r>
+              <ns0:t>O comando migrate terminou com OK.</ns0:t>
+            </ns0:r>
+          </ns0:p>
+        </ns0:tc>
+        <ns0:tc>
+          <ns0:tcPr>
+            <ns0:tcW ns0:type="dxa" ns0:w="4896"/>
+          </ns0:tcPr>
+          <ns0:p>
+            <ns0:pPr>
+              <ns0:jc ns0:val="center"/>
+            </ns0:pPr>
+            <ns0:r>
+              <ns0:t>☐</ns0:t>
+            </ns0:r>
+          </ns0:p>
+        </ns0:tc>
+      </ns0:tr>
+      <ns0:tr>
+        <ns0:tc>
+          <ns0:tcPr>
+            <ns0:tcW ns0:type="dxa" ns0:w="4896"/>
+          </ns0:tcPr>
+          <ns0:p>
+            <ns0:r>
+              <ns0:t>O ficheiro db.sqlite3 foi criado.</ns0:t>
+            </ns0:r>
+          </ns0:p>
+        </ns0:tc>
+        <ns0:tc>
+          <ns0:tcPr>
+            <ns0:tcW ns0:type="dxa" ns0:w="4896"/>
+          </ns0:tcPr>
+          <ns0:p>
+            <ns0:pPr>
+              <ns0:jc ns0:val="center"/>
+            </ns0:pPr>
+            <ns0:r>
+              <ns0:t>☐</ns0:t>
+            </ns0:r>
+          </ns0:p>
+        </ns0:tc>
+      </ns0:tr>
+      <ns0:tr>
+        <ns0:tc>
+          <ns0:tcPr>
+            <ns0:tcW ns0:type="dxa" ns0:w="4896"/>
+          </ns0:tcPr>
+          <ns0:p>
+            <ns0:r>
+              <ns0:t>A página http://127.0.0.1:8000/ abriu no navegador.</ns0:t>
+            </ns0:r>
+          </ns0:p>
+        </ns0:tc>
+        <ns0:tc>
+          <ns0:tcPr>
+            <ns0:tcW ns0:type="dxa" ns0:w="4896"/>
+          </ns0:tcPr>
+          <ns0:p>
+            <ns0:pPr>
+              <ns0:jc ns0:val="center"/>
+            </ns0:pPr>
+            <ns0:r>
+              <ns0:t>☐</ns0:t>
+            </ns0:r>
+          </ns0:p>
+        </ns0:tc>
+      </ns0:tr>
+      <ns0:tr>
+        <ns0:tc>
+          <ns0:tcPr>
+            <ns0:tcW ns0:type="dxa" ns0:w="4896"/>
+          </ns0:tcPr>
+          <ns0:p>
+            <ns0:r>
+              <ns0:t>O servidor foi parado com CTRL + C.</ns0:t>
+            </ns0:r>
+          </ns0:p>
+        </ns0:tc>
+        <ns0:tc>
+          <ns0:tcPr>
+            <ns0:tcW ns0:type="dxa" ns0:w="4896"/>
+          </ns0:tcPr>
+          <ns0:p>
+            <ns0:pPr>
+              <ns0:jc ns0:val="center"/>
+            </ns0:pPr>
+            <ns0:r>
+              <ns0:t>☐</ns0:t>
+            </ns0:r>
+          </ns0:p>
+        </ns0:tc>
+      </ns0:tr>
+    </ns0:tbl>
+    <ns0:p>
+      <ns0:pPr>
+        <ns0:pStyle ns0:val="Heading1"/>
+      </ns0:pPr>
+      <ns0:r>
+        <ns0:t>Exercício prático</ns0:t>
+      </ns0:r>
+    </ns0:p>
+    <ns0:p>
+      <ns0:r>
+        <ns0:t>Executa todos os passos abaixo sem copiar apenas o resultado final:</ns0:t>
+      </ns0:r>
+    </ns0:p>
+    <ns0:p>
+      <ns0:pPr>
+        <ns0:pStyle ns0:val="CodeBlock"/>
+        <ns0:keepLines/>
+        <ns0:widowControl/>
+        <ns0:shd ns0:fill="F3F4F6"/>
+        <ns0:pBdr>
+          <ns0:bottom ns0:val="single" ns0:sz="4" ns0:space="1" ns0:color="CBD5E1"/>
+        </ns0:pBdr>
+      </ns0:pPr>
+      <ns0:r>
+        <ns0:rPr>
+          <ns0:rFonts ns0:ascii="Consolas" ns0:hAnsi="Consolas" ns0:eastAsia="Consolas"/>
+        </ns0:rPr>
+        <ns0:t>mkdir taskflow</ns0:t>
+        <ns0:br/>
+        <ns0:t>cd taskflow</ns0:t>
+        <ns0:br/>
+        <ns0:t>python -m venv .venv</ns0:t>
+        <ns0:br/>
+        <ns0:t>python -m pip install django</ns0:t>
+        <ns0:br/>
+        <ns0:t>django-admin startproject config .</ns0:t>
+        <ns0:br/>
+        <ns0:t>python manage.py migrate</ns0:t>
+        <ns0:br/>
+        <ns0:t>python manage.py runserver</ns0:t>
+      </ns0:r>
+    </ns0:p>
+    <ns0:p>
+      <ns0:r>
+        <ns0:t>Depois confirma:</ns0:t>
+      </ns0:r>
+    </ns0:p>
+    <ns0:p>
+      <ns0:pPr>
+        <ns0:pStyle ns0:val="ListNumber"/>
+        <ns0:spacing ns0:after="40"/>
+      </ns0:pPr>
+      <ns0:r>
+        <ns0:t>A página padrão do Django abriu no navegador.</ns0:t>
+      </ns0:r>
+    </ns0:p>
+    <ns0:p>
+      <ns0:pPr>
+        <ns0:pStyle ns0:val="ListNumber"/>
+        <ns0:spacing ns0:after="40"/>
+      </ns0:pPr>
+      <ns0:r>
+        <ns0:t>O ficheiro `db.sqlite3` foi criado.</ns0:t>
+      </ns0:r>
+    </ns0:p>
+    <ns0:p>
+      <ns0:pPr>
+        <ns0:pStyle ns0:val="ListNumber"/>
+        <ns0:spacing ns0:after="40"/>
+      </ns0:pPr>
+      <ns0:r>
+        <ns0:t>O comando `python -m django --version` mostra a versão instalada.</ns0:t>
+      </ns0:r>
+    </ns0:p>
+    <ns0:p>
+      <ns0:pPr>
+        <ns0:pStyle ns0:val="ListNumber"/>
+        <ns0:spacing ns0:after="40"/>
+      </ns0:pPr>
+      <ns0:r>
+        <ns0:t>A estrutura de pastas corresponde à apresentada nesta aula.</ns0:t>
+      </ns0:r>
+    </ns0:p>
+    <ns0:tbl>
+      <ns0:tblPr>
+        <ns0:tblW ns0:type="auto" ns0:w="0"/>
+        <ns0:jc ns0:val="center"/>
+        <ns0:tblLook ns0:firstColumn="1" ns0:firstRow="1" ns0:lastColumn="0" ns0:lastRow="0" ns0:noHBand="0" ns0:noVBand="1" ns0:val="04A0"/>
+      </ns0:tblPr>
+      <ns0:tblGrid>
+        <ns0:gridCol ns0:w="9792"/>
+      </ns0:tblGrid>
+      <ns0:tr>
+        <ns0:tc>
+          <ns0:tcPr>
+            <ns0:tcW ns0:type="dxa" ns0:w="9792"/>
+            <ns0:shd ns0:fill="E0F2FE"/>
+            <ns0:tcBorders>
+              <ns0:top ns0:val="single" ns0:sz="6" ns0:color="93C5FD"/>
+              <ns0:left ns0:val="single" ns0:sz="6" ns0:color="93C5FD"/>
+              <ns0:bottom ns0:val="single" ns0:sz="6" ns0:color="93C5FD"/>
+              <ns0:right ns0:val="single" ns0:sz="6" ns0:color="93C5FD"/>
+            </ns0:tcBorders>
+          </ns0:tcPr>
+          <ns0:p>
+            <ns0:pPr>
+              <ns0:spacing ns0:after="40"/>
+            </ns0:pPr>
+            <ns0:r>
+              <ns0:rPr>
+                <ns0:b/>
+                <ns0:color ns0:val="123B5D"/>
+              </ns0:rPr>
+              <ns0:t>Próxima aulaNa Aula 2 vamos criar a app `produtos` e preparar o catálogo que será apresentado na primeira página da Aula 3.</ns0:t>
+              <ns0:br/>
+            </ns0:r>
+            <ns0:r>
+              <ns0:t/>
+            </ns0:r>
+          </ns0:p>
+        </ns0:tc>
+      </ns0:tr>
+    </ns0:tbl>
+    <ns0:p>
+      <ns0:pPr>
+        <ns0:spacing ns0:after="0"/>
+      </ns0:pPr>
+    </ns0:p>
+    <ns0:p>
+      <ns0:pPr>
+        <ns0:pStyle ns0:val="Heading1"/>
+      </ns0:pPr>
+      <ns0:r>
+        <ns0:t>Resumo essencial</ns0:t>
+      </ns0:r>
+    </ns0:p>
+    <ns0:p>
+      <ns0:pPr>
+        <ns0:pStyle ns0:val="ListBullet"/>
+        <ns0:spacing ns0:after="40"/>
+      </ns0:pPr>
+      <ns0:r>
+        <ns0:t>Django recebe pedidos HTTP e devolve respostas.</ns0:t>
+      </ns0:r>
+    </ns0:p>
+    <ns0:p>
+      <ns0:pPr>
+        <ns0:pStyle ns0:val="ListBullet"/>
+        <ns0:spacing ns0:after="40"/>
+      </ns0:pPr>
+      <ns0:r>
+        <ns0:t>Um projeto contém a configuração geral; uma app contém uma funcionalidade.</ns0:t>
+      </ns0:r>
+    </ns0:p>
+    <ns0:p>
+      <ns0:pPr>
+        <ns0:pStyle ns0:val="ListBullet"/>
+        <ns0:spacing ns0:after="40"/>
+      </ns0:pPr>
+      <ns0:r>
+        <ns0:t>O ambiente virtual mantém as dependências isoladas.</ns0:t>
+      </ns0:r>
+    </ns0:p>
+    <ns0:p>
+      <ns0:pPr>
+        <ns0:pStyle ns0:val="ListBullet"/>
+        <ns0:spacing ns0:after="40"/>
+      </ns0:pPr>
+      <ns0:r>
+        <ns0:t>`manage.py` é o centro de operações do projeto.</ns0:t>
+      </ns0:r>
+    </ns0:p>
+    <ns0:p>
+      <ns0:pPr>
+        <ns0:pStyle ns0:val="ListBullet"/>
+        <ns0:spacing ns0:after="40"/>
+      </ns0:pPr>
+      <ns0:r>
+        <ns0:t>`migrate` cria e atualiza a estrutura da base de dados.</ns0:t>
+      </ns0:r>
+    </ns0:p>
+    <ns0:p>
+      <ns0:pPr>
+        <ns0:pStyle ns0:val="ListBullet"/>
+        <ns0:spacing ns0:after="40"/>
+      </ns0:pPr>
+      <ns0:r>
+        <ns0:t>`runserver` inicia o servidor de desenvolvimento local.</ns0:t>
+      </ns0:r>
+    </ns0:p>
+    <ns0:p>
+      <ns0:pPr>
+        <ns0:pStyle ns0:val="ListBullet"/>
+        <ns0:spacing ns0:after="40"/>
+      </ns0:pPr>
+      <ns0:r>
+        <ns0:t>O navegador comunica com o Django através de URLs e pedidos HTTP.</ns0:t>
+      </ns0:r>
+    </ns0:p>
+    <ns0:sectPr ns0:rsidR="00FC693F" ns0:rsidRPr="0006063C" ns0:rsidSect="00034616">
+      <ns0:footerReference ns0:type="default" ns5:id="rId9"/>
+      <ns0:headerReference ns0:type="default" ns5:id="rId11"/>
+      <ns0:pgSz ns0:w="12240" ns0:h="15840"/>
+      <ns0:pgMar ns0:top="1080" ns0:right="1224" ns0:bottom="1008" ns0:left="1224" ns0:header="720" ns0:footer="720" ns0:gutter="0"/>
+      <ns0:cols ns0:space="720"/>
+      <ns0:docGrid ns0:linePitch="360"/>
+    </ns0:sectPr>
+  </ns0:body>
+</ns0:document>
 </file>
 
 <file path=word/footer1.xml><?xml version="1.0" encoding="utf-8"?>

</xml_diff>